<commit_message>
Add final report and presentation deliverables
</commit_message>
<xml_diff>
--- a/docs/proposal_final_reports/BudgetBuddy_Final_Report_Draft.docx
+++ b/docs/proposal_final_reports/BudgetBuddy_Final_Report_Draft.docx
@@ -1494,6 +1494,9 @@
     </w:p>
     <w:p>
       <w:r>
+        <w:rPr>
+          <w:noProof/>
+        </w:rPr>
         <w:drawing>
           <wp:inline distT="0" distB="0" distL="0" distR="0" wp14:anchorId="011943F8" wp14:editId="299A668D">
             <wp:extent cx="4114800" cy="2743200"/>
@@ -1555,37 +1558,7 @@
         <w:rPr>
           <w:color w:val="auto"/>
         </w:rPr>
-        <w:t>Architecture Layers</w:t>
-      </w:r>
-      <w:r>
-        <w:rPr>
-          <w:color w:val="auto"/>
-        </w:rPr>
-        <w:t xml:space="preserve"> / </w:t>
-      </w:r>
-      <w:r>
-        <w:rPr>
-          <w:color w:val="auto"/>
-        </w:rPr>
-        <w:t>Core Flows</w:t>
-      </w:r>
-      <w:r>
-        <w:rPr>
-          <w:color w:val="auto"/>
-        </w:rPr>
-        <w:t xml:space="preserve"> / </w:t>
-      </w:r>
-      <w:r>
-        <w:rPr>
-          <w:color w:val="auto"/>
-        </w:rPr>
-        <w:t>Agent Design</w:t>
-      </w:r>
-      <w:r>
-        <w:rPr>
-          <w:color w:val="auto"/>
-        </w:rPr>
-        <w:t>.</w:t>
+        <w:t>Architecture Layers / Core Flows / Agent Design.</w:t>
       </w:r>
     </w:p>
     <w:p>
@@ -1873,19 +1846,7 @@
         <w:rPr>
           <w:color w:val="auto"/>
         </w:rPr>
-        <w:t>6.3.</w:t>
-      </w:r>
-      <w:r>
-        <w:rPr>
-          <w:color w:val="auto"/>
-        </w:rPr>
-        <w:t>4</w:t>
-      </w:r>
-      <w:r>
-        <w:rPr>
-          <w:color w:val="auto"/>
-        </w:rPr>
-        <w:t xml:space="preserve">. </w:t>
+        <w:t xml:space="preserve">6.3.4. </w:t>
       </w:r>
       <w:r>
         <w:rPr>
@@ -1906,10 +1867,10 @@
       </w:pPr>
       <w:r>
         <w:drawing>
-          <wp:inline distT="0" distB="0" distL="0" distR="0" wp14:anchorId="10E36D3D" wp14:editId="7FE287C9">
-            <wp:extent cx="4457700" cy="1663789"/>
+          <wp:inline distT="0" distB="0" distL="0" distR="0" wp14:anchorId="0A43EFAE" wp14:editId="3572871A">
+            <wp:extent cx="5033624" cy="2834640"/>
             <wp:effectExtent l="0" t="0" r="0" b="0"/>
-            <wp:docPr id="114156157" name="Picture 1"/>
+            <wp:docPr id="36478222" name="Picture 1"/>
             <wp:cNvGraphicFramePr>
               <a:graphicFrameLocks xmlns:a="http://schemas.openxmlformats.org/drawingml/2006/main" noChangeAspect="1"/>
             </wp:cNvGraphicFramePr>
@@ -1917,7 +1878,7 @@
               <a:graphicData uri="http://schemas.openxmlformats.org/drawingml/2006/picture">
                 <pic:pic xmlns:pic="http://schemas.openxmlformats.org/drawingml/2006/picture">
                   <pic:nvPicPr>
-                    <pic:cNvPr id="114156157" name=""/>
+                    <pic:cNvPr id="36478222" name=""/>
                     <pic:cNvPicPr/>
                   </pic:nvPicPr>
                   <pic:blipFill>
@@ -1929,7 +1890,7 @@
                   <pic:spPr>
                     <a:xfrm>
                       <a:off x="0" y="0"/>
-                      <a:ext cx="4471290" cy="1668861"/>
+                      <a:ext cx="5040177" cy="2838330"/>
                     </a:xfrm>
                     <a:prstGeom prst="rect">
                       <a:avLst/>
@@ -2172,6 +2133,7 @@
         <w:rPr>
           <w:color w:val="auto"/>
         </w:rPr>
+        <w:lastRenderedPageBreak/>
         <w:t>8. LIMITATIONS AND FUTURE WORK</w:t>
       </w:r>
     </w:p>
@@ -2221,7 +2183,6 @@
         <w:rPr>
           <w:color w:val="auto"/>
         </w:rPr>
-        <w:lastRenderedPageBreak/>
         <w:t>8.2 Future Work</w:t>
       </w:r>
     </w:p>
@@ -4679,7 +4640,7 @@
   <w:style w:type="paragraph" w:default="1" w:styleId="Normal">
     <w:name w:val="Normal"/>
     <w:qFormat/>
-    <w:rsid w:val="0011037F"/>
+    <w:rsid w:val="00451F0F"/>
     <w:pPr>
       <w:spacing w:after="0" w:line="264" w:lineRule="auto"/>
       <w:jc w:val="both"/>
@@ -4699,7 +4660,7 @@
     <w:autoRedefine/>
     <w:uiPriority w:val="9"/>
     <w:qFormat/>
-    <w:rsid w:val="0011037F"/>
+    <w:rsid w:val="00451F0F"/>
     <w:pPr>
       <w:keepNext/>
       <w:keepLines/>
@@ -4723,7 +4684,7 @@
     <w:uiPriority w:val="9"/>
     <w:unhideWhenUsed/>
     <w:qFormat/>
-    <w:rsid w:val="0011037F"/>
+    <w:rsid w:val="00451F0F"/>
     <w:pPr>
       <w:keepNext/>
       <w:keepLines/>
@@ -4747,7 +4708,7 @@
     <w:uiPriority w:val="9"/>
     <w:unhideWhenUsed/>
     <w:qFormat/>
-    <w:rsid w:val="0011037F"/>
+    <w:rsid w:val="00451F0F"/>
     <w:pPr>
       <w:keepNext/>
       <w:keepLines/>
@@ -4769,7 +4730,7 @@
     <w:uiPriority w:val="9"/>
     <w:unhideWhenUsed/>
     <w:qFormat/>
-    <w:rsid w:val="0011037F"/>
+    <w:rsid w:val="00451F0F"/>
     <w:pPr>
       <w:keepNext/>
       <w:keepLines/>
@@ -4792,7 +4753,7 @@
     <w:uiPriority w:val="9"/>
     <w:unhideWhenUsed/>
     <w:qFormat/>
-    <w:rsid w:val="0011037F"/>
+    <w:rsid w:val="00451F0F"/>
     <w:pPr>
       <w:keepNext/>
       <w:keepLines/>
@@ -4813,7 +4774,7 @@
     <w:link w:val="Heading6Char"/>
     <w:unhideWhenUsed/>
     <w:qFormat/>
-    <w:rsid w:val="0011037F"/>
+    <w:rsid w:val="00451F0F"/>
     <w:pPr>
       <w:keepNext/>
       <w:numPr>
@@ -4837,7 +4798,7 @@
     <w:link w:val="Heading7Char"/>
     <w:unhideWhenUsed/>
     <w:qFormat/>
-    <w:rsid w:val="0011037F"/>
+    <w:rsid w:val="00451F0F"/>
     <w:pPr>
       <w:keepNext/>
       <w:numPr>
@@ -4862,7 +4823,7 @@
     <w:link w:val="Heading8Char"/>
     <w:unhideWhenUsed/>
     <w:qFormat/>
-    <w:rsid w:val="0011037F"/>
+    <w:rsid w:val="00451F0F"/>
     <w:pPr>
       <w:keepNext/>
       <w:numPr>
@@ -4889,7 +4850,7 @@
     <w:link w:val="Heading9Char"/>
     <w:unhideWhenUsed/>
     <w:qFormat/>
-    <w:rsid w:val="0011037F"/>
+    <w:rsid w:val="00451F0F"/>
     <w:pPr>
       <w:keepNext/>
       <w:numPr>
@@ -4909,8 +4870,9 @@
   <w:style w:type="character" w:default="1" w:styleId="DefaultParagraphFont">
     <w:name w:val="Default Paragraph Font"/>
     <w:uiPriority w:val="1"/>
+    <w:semiHidden/>
     <w:unhideWhenUsed/>
-    <w:rsid w:val="0011037F"/>
+    <w:rsid w:val="00451F0F"/>
   </w:style>
   <w:style w:type="table" w:default="1" w:styleId="TableNormal">
     <w:name w:val="Normal Table"/>
@@ -4932,14 +4894,14 @@
     <w:uiPriority w:val="99"/>
     <w:semiHidden/>
     <w:unhideWhenUsed/>
-    <w:rsid w:val="0011037F"/>
+    <w:rsid w:val="00451F0F"/>
   </w:style>
   <w:style w:type="character" w:styleId="Hyperlink">
     <w:name w:val="Hyperlink"/>
     <w:basedOn w:val="DefaultParagraphFont"/>
     <w:uiPriority w:val="99"/>
     <w:unhideWhenUsed/>
-    <w:rsid w:val="0011037F"/>
+    <w:rsid w:val="00451F0F"/>
     <w:rPr>
       <w:rFonts w:ascii="Linux Libertine" w:hAnsi="Linux Libertine" w:cs="Linux Libertine"/>
       <w:color w:val="467886" w:themeColor="hyperlink"/>
@@ -4963,7 +4925,7 @@
     <w:basedOn w:val="DefaultParagraphFont"/>
     <w:link w:val="Heading2"/>
     <w:uiPriority w:val="9"/>
-    <w:rsid w:val="0011037F"/>
+    <w:rsid w:val="00451F0F"/>
     <w:rPr>
       <w:rFonts w:asciiTheme="majorHAnsi" w:eastAsiaTheme="majorEastAsia" w:hAnsiTheme="majorHAnsi" w:cstheme="majorBidi"/>
       <w:b/>
@@ -4979,7 +4941,7 @@
     <w:basedOn w:val="DefaultParagraphFont"/>
     <w:link w:val="Heading3"/>
     <w:uiPriority w:val="9"/>
-    <w:rsid w:val="0011037F"/>
+    <w:rsid w:val="00451F0F"/>
     <w:rPr>
       <w:rFonts w:asciiTheme="majorHAnsi" w:eastAsiaTheme="majorEastAsia" w:hAnsiTheme="majorHAnsi" w:cstheme="majorBidi"/>
       <w:b/>
@@ -4995,7 +4957,7 @@
     <w:basedOn w:val="DefaultParagraphFont"/>
     <w:link w:val="Heading4"/>
     <w:uiPriority w:val="9"/>
-    <w:rsid w:val="0011037F"/>
+    <w:rsid w:val="00451F0F"/>
     <w:rPr>
       <w:rFonts w:asciiTheme="majorHAnsi" w:eastAsiaTheme="majorEastAsia" w:hAnsiTheme="majorHAnsi" w:cstheme="majorBidi"/>
       <w:bCs/>
@@ -5010,7 +4972,7 @@
   <w:style w:type="table" w:styleId="TableGrid">
     <w:name w:val="Table Grid"/>
     <w:basedOn w:val="TableNormal"/>
-    <w:rsid w:val="0011037F"/>
+    <w:rsid w:val="00451F0F"/>
     <w:pPr>
       <w:spacing w:after="0" w:line="240" w:lineRule="auto"/>
     </w:pPr>
@@ -5036,7 +4998,7 @@
     <w:basedOn w:val="DefaultParagraphFont"/>
     <w:link w:val="Heading1"/>
     <w:uiPriority w:val="9"/>
-    <w:rsid w:val="0011037F"/>
+    <w:rsid w:val="00451F0F"/>
     <w:rPr>
       <w:rFonts w:asciiTheme="majorHAnsi" w:eastAsiaTheme="majorEastAsia" w:hAnsiTheme="majorHAnsi" w:cstheme="majorBidi"/>
       <w:b/>
@@ -5052,7 +5014,7 @@
     <w:basedOn w:val="DefaultParagraphFont"/>
     <w:link w:val="Heading5"/>
     <w:uiPriority w:val="9"/>
-    <w:rsid w:val="0011037F"/>
+    <w:rsid w:val="00451F0F"/>
     <w:rPr>
       <w:rFonts w:asciiTheme="majorHAnsi" w:eastAsiaTheme="majorEastAsia" w:hAnsiTheme="majorHAnsi" w:cstheme="majorBidi"/>
       <w:b/>
@@ -5066,7 +5028,7 @@
     <w:name w:val="Heading 6 Char"/>
     <w:basedOn w:val="DefaultParagraphFont"/>
     <w:link w:val="Heading6"/>
-    <w:rsid w:val="0011037F"/>
+    <w:rsid w:val="00451F0F"/>
     <w:rPr>
       <w:rFonts w:ascii="Linux Libertine" w:eastAsia="Times New Roman" w:hAnsi="Linux Libertine" w:cs="Linux Libertine"/>
       <w:bCs/>
@@ -5079,7 +5041,7 @@
     <w:name w:val="Heading 7 Char"/>
     <w:basedOn w:val="DefaultParagraphFont"/>
     <w:link w:val="Heading7"/>
-    <w:rsid w:val="0011037F"/>
+    <w:rsid w:val="00451F0F"/>
     <w:rPr>
       <w:rFonts w:ascii="Linux Libertine" w:eastAsia="Times New Roman" w:hAnsi="Linux Libertine" w:cs="Linux Libertine"/>
       <w:b/>
@@ -5091,7 +5053,7 @@
     <w:name w:val="Heading 8 Char"/>
     <w:basedOn w:val="DefaultParagraphFont"/>
     <w:link w:val="Heading8"/>
-    <w:rsid w:val="0011037F"/>
+    <w:rsid w:val="00451F0F"/>
     <w:rPr>
       <w:rFonts w:ascii="Linux Libertine" w:eastAsia="Times New Roman" w:hAnsi="Linux Libertine" w:cs="Linux Libertine"/>
       <w:b/>
@@ -5105,7 +5067,7 @@
     <w:name w:val="Heading 9 Char"/>
     <w:basedOn w:val="DefaultParagraphFont"/>
     <w:link w:val="Heading9"/>
-    <w:rsid w:val="0011037F"/>
+    <w:rsid w:val="00451F0F"/>
     <w:rPr>
       <w:rFonts w:ascii="Linux Libertine" w:eastAsia="Times New Roman" w:hAnsi="Linux Libertine" w:cs="Arial"/>
       <w:i/>
@@ -5119,7 +5081,7 @@
     <w:basedOn w:val="Normal"/>
     <w:link w:val="FooterChar"/>
     <w:semiHidden/>
-    <w:rsid w:val="0011037F"/>
+    <w:rsid w:val="00451F0F"/>
     <w:pPr>
       <w:tabs>
         <w:tab w:val="center" w:pos="4320"/>
@@ -5132,7 +5094,7 @@
     <w:basedOn w:val="DefaultParagraphFont"/>
     <w:link w:val="Footer"/>
     <w:semiHidden/>
-    <w:rsid w:val="0011037F"/>
+    <w:rsid w:val="00451F0F"/>
     <w:rPr>
       <w:rFonts w:ascii="Linux Libertine" w:eastAsiaTheme="minorHAnsi" w:hAnsi="Linux Libertine" w:cs="Linux Libertine"/>
       <w:kern w:val="0"/>
@@ -5146,7 +5108,7 @@
     <w:uiPriority w:val="99"/>
     <w:semiHidden/>
     <w:unhideWhenUsed/>
-    <w:rsid w:val="0011037F"/>
+    <w:rsid w:val="00451F0F"/>
     <w:rPr>
       <w:rFonts w:ascii="Linux Libertine" w:hAnsi="Linux Libertine" w:cs="Linux Libertine"/>
       <w:vertAlign w:val="superscript"/>
@@ -5157,7 +5119,7 @@
     <w:basedOn w:val="Normal"/>
     <w:link w:val="FootnoteTextChar"/>
     <w:semiHidden/>
-    <w:rsid w:val="0011037F"/>
+    <w:rsid w:val="00451F0F"/>
     <w:rPr>
       <w:sz w:val="14"/>
     </w:rPr>
@@ -5167,7 +5129,7 @@
     <w:basedOn w:val="DefaultParagraphFont"/>
     <w:link w:val="FootnoteText"/>
     <w:semiHidden/>
-    <w:rsid w:val="0011037F"/>
+    <w:rsid w:val="00451F0F"/>
     <w:rPr>
       <w:rFonts w:ascii="Linux Libertine" w:eastAsiaTheme="minorHAnsi" w:hAnsi="Linux Libertine" w:cs="Linux Libertine"/>
       <w:kern w:val="0"/>
@@ -5178,7 +5140,7 @@
   <w:style w:type="numbering" w:customStyle="1" w:styleId="SIGPLANListbullet">
     <w:name w:val="SIGPLAN List bullet"/>
     <w:basedOn w:val="NoList"/>
-    <w:rsid w:val="0011037F"/>
+    <w:rsid w:val="00451F0F"/>
     <w:pPr>
       <w:numPr>
         <w:numId w:val="17"/>
@@ -5188,7 +5150,7 @@
   <w:style w:type="numbering" w:customStyle="1" w:styleId="SIGPLANListletter">
     <w:name w:val="SIGPLAN List letter"/>
     <w:basedOn w:val="NoList"/>
-    <w:rsid w:val="0011037F"/>
+    <w:rsid w:val="00451F0F"/>
     <w:pPr>
       <w:numPr>
         <w:numId w:val="18"/>
@@ -5198,7 +5160,7 @@
   <w:style w:type="numbering" w:customStyle="1" w:styleId="SIGPLANListnumber">
     <w:name w:val="SIGPLAN List number"/>
     <w:basedOn w:val="NoList"/>
-    <w:rsid w:val="0011037F"/>
+    <w:rsid w:val="00451F0F"/>
     <w:pPr>
       <w:numPr>
         <w:numId w:val="19"/>
@@ -5210,7 +5172,7 @@
     <w:basedOn w:val="Normal"/>
     <w:link w:val="BalloonTextChar"/>
     <w:semiHidden/>
-    <w:rsid w:val="0011037F"/>
+    <w:rsid w:val="00451F0F"/>
     <w:rPr>
       <w:rFonts w:ascii="Tahoma" w:hAnsi="Tahoma" w:cs="Tahoma"/>
       <w:sz w:val="16"/>
@@ -5222,7 +5184,7 @@
     <w:basedOn w:val="DefaultParagraphFont"/>
     <w:link w:val="BalloonText"/>
     <w:semiHidden/>
-    <w:rsid w:val="0011037F"/>
+    <w:rsid w:val="00451F0F"/>
     <w:rPr>
       <w:rFonts w:ascii="Tahoma" w:eastAsiaTheme="minorHAnsi" w:hAnsi="Tahoma" w:cs="Tahoma"/>
       <w:kern w:val="0"/>
@@ -5234,7 +5196,7 @@
     <w:name w:val="annotation reference"/>
     <w:basedOn w:val="DefaultParagraphFont"/>
     <w:semiHidden/>
-    <w:rsid w:val="0011037F"/>
+    <w:rsid w:val="00451F0F"/>
     <w:rPr>
       <w:sz w:val="16"/>
       <w:szCs w:val="16"/>
@@ -5245,7 +5207,7 @@
     <w:basedOn w:val="Normal"/>
     <w:link w:val="CommentTextChar"/>
     <w:semiHidden/>
-    <w:rsid w:val="0011037F"/>
+    <w:rsid w:val="00451F0F"/>
     <w:rPr>
       <w:sz w:val="20"/>
     </w:rPr>
@@ -5255,7 +5217,7 @@
     <w:basedOn w:val="DefaultParagraphFont"/>
     <w:link w:val="CommentText"/>
     <w:semiHidden/>
-    <w:rsid w:val="0011037F"/>
+    <w:rsid w:val="00451F0F"/>
     <w:rPr>
       <w:rFonts w:ascii="Linux Libertine" w:eastAsiaTheme="minorHAnsi" w:hAnsi="Linux Libertine" w:cs="Linux Libertine"/>
       <w:kern w:val="0"/>
@@ -5269,7 +5231,7 @@
     <w:next w:val="CommentText"/>
     <w:link w:val="CommentSubjectChar"/>
     <w:semiHidden/>
-    <w:rsid w:val="0011037F"/>
+    <w:rsid w:val="00451F0F"/>
     <w:rPr>
       <w:b/>
       <w:bCs/>
@@ -5280,7 +5242,7 @@
     <w:basedOn w:val="CommentTextChar"/>
     <w:link w:val="CommentSubject"/>
     <w:semiHidden/>
-    <w:rsid w:val="0011037F"/>
+    <w:rsid w:val="00451F0F"/>
     <w:rPr>
       <w:rFonts w:ascii="Linux Libertine" w:eastAsiaTheme="minorHAnsi" w:hAnsi="Linux Libertine" w:cs="Linux Libertine"/>
       <w:b/>
@@ -5295,7 +5257,7 @@
     <w:basedOn w:val="Normal"/>
     <w:link w:val="HeaderChar"/>
     <w:semiHidden/>
-    <w:rsid w:val="0011037F"/>
+    <w:rsid w:val="00451F0F"/>
     <w:pPr>
       <w:tabs>
         <w:tab w:val="center" w:pos="4320"/>
@@ -5308,7 +5270,7 @@
     <w:basedOn w:val="DefaultParagraphFont"/>
     <w:link w:val="Header"/>
     <w:semiHidden/>
-    <w:rsid w:val="0011037F"/>
+    <w:rsid w:val="00451F0F"/>
     <w:rPr>
       <w:rFonts w:ascii="Linux Libertine" w:eastAsiaTheme="minorHAnsi" w:hAnsi="Linux Libertine" w:cs="Linux Libertine"/>
       <w:kern w:val="0"/>
@@ -5321,7 +5283,7 @@
     <w:link w:val="AbsHeadChar"/>
     <w:autoRedefine/>
     <w:qFormat/>
-    <w:rsid w:val="0011037F"/>
+    <w:rsid w:val="00451F0F"/>
     <w:pPr>
       <w:keepNext/>
       <w:spacing w:before="120" w:after="80" w:line="240" w:lineRule="auto"/>
@@ -5339,7 +5301,7 @@
     <w:name w:val="AbsHead Char"/>
     <w:basedOn w:val="DefaultParagraphFont"/>
     <w:link w:val="AbsHead"/>
-    <w:rsid w:val="0011037F"/>
+    <w:rsid w:val="00451F0F"/>
     <w:rPr>
       <w:rFonts w:ascii="Linux Biolinum" w:eastAsiaTheme="minorHAnsi" w:hAnsi="Linux Biolinum" w:cs="Linux Biolinum"/>
       <w:b/>
@@ -5352,7 +5314,7 @@
   <w:style w:type="paragraph" w:customStyle="1" w:styleId="Abstract">
     <w:name w:val="Abstract"/>
     <w:qFormat/>
-    <w:rsid w:val="0011037F"/>
+    <w:rsid w:val="00451F0F"/>
     <w:pPr>
       <w:spacing w:before="20" w:after="120" w:line="264" w:lineRule="auto"/>
       <w:jc w:val="both"/>
@@ -5369,7 +5331,7 @@
     <w:basedOn w:val="DefaultParagraphFont"/>
     <w:uiPriority w:val="1"/>
     <w:qFormat/>
-    <w:rsid w:val="0011037F"/>
+    <w:rsid w:val="00451F0F"/>
     <w:rPr>
       <w:rFonts w:ascii="Linux Libertine" w:hAnsi="Linux Libertine" w:cs="Linux Libertine"/>
       <w:color w:val="FF0000"/>
@@ -5380,7 +5342,7 @@
     <w:link w:val="AckHeadChar"/>
     <w:autoRedefine/>
     <w:qFormat/>
-    <w:rsid w:val="0011037F"/>
+    <w:rsid w:val="00451F0F"/>
     <w:pPr>
       <w:keepNext/>
       <w:spacing w:before="120" w:after="40" w:line="240" w:lineRule="auto"/>
@@ -5397,7 +5359,7 @@
     <w:name w:val="AckHead Char"/>
     <w:basedOn w:val="DefaultParagraphFont"/>
     <w:link w:val="AckHead"/>
-    <w:rsid w:val="0011037F"/>
+    <w:rsid w:val="00451F0F"/>
     <w:rPr>
       <w:rFonts w:ascii="Linux Biolinum" w:eastAsiaTheme="minorHAnsi" w:hAnsi="Linux Biolinum" w:cs="Linux Biolinum"/>
       <w:b/>
@@ -5410,7 +5372,7 @@
     <w:name w:val="AckPara"/>
     <w:autoRedefine/>
     <w:qFormat/>
-    <w:rsid w:val="0011037F"/>
+    <w:rsid w:val="00451F0F"/>
     <w:pPr>
       <w:spacing w:after="0" w:line="264" w:lineRule="auto"/>
       <w:jc w:val="both"/>
@@ -5426,7 +5388,7 @@
     <w:name w:val="Para"/>
     <w:autoRedefine/>
     <w:qFormat/>
-    <w:rsid w:val="0011037F"/>
+    <w:rsid w:val="00451F0F"/>
     <w:pPr>
       <w:spacing w:after="0" w:line="264" w:lineRule="auto"/>
       <w:ind w:firstLine="240"/>
@@ -5444,7 +5406,7 @@
     <w:next w:val="Para"/>
     <w:autoRedefine/>
     <w:qFormat/>
-    <w:rsid w:val="0011037F"/>
+    <w:rsid w:val="00451F0F"/>
     <w:pPr>
       <w:numPr>
         <w:numId w:val="22"/>
@@ -5459,7 +5421,7 @@
   </w:style>
   <w:style w:type="paragraph" w:customStyle="1" w:styleId="Address">
     <w:name w:val="Address"/>
-    <w:rsid w:val="0011037F"/>
+    <w:rsid w:val="00451F0F"/>
     <w:pPr>
       <w:spacing w:before="240" w:after="240" w:line="560" w:lineRule="exact"/>
       <w:ind w:left="720" w:right="720"/>
@@ -5476,7 +5438,7 @@
     <w:name w:val="Affiliation"/>
     <w:autoRedefine/>
     <w:qFormat/>
-    <w:rsid w:val="0011037F"/>
+    <w:rsid w:val="00451F0F"/>
     <w:pPr>
       <w:spacing w:after="0" w:line="240" w:lineRule="auto"/>
     </w:pPr>
@@ -5490,7 +5452,7 @@
   <w:style w:type="paragraph" w:customStyle="1" w:styleId="AlgorithmCaption">
     <w:name w:val="AlgorithmCaption"/>
     <w:basedOn w:val="Normal"/>
-    <w:rsid w:val="0011037F"/>
+    <w:rsid w:val="00451F0F"/>
     <w:pPr>
       <w:pBdr>
         <w:top w:val="single" w:sz="4" w:space="2" w:color="auto"/>
@@ -5503,7 +5465,7 @@
     <w:basedOn w:val="DefaultParagraphFont"/>
     <w:uiPriority w:val="1"/>
     <w:qFormat/>
-    <w:rsid w:val="0011037F"/>
+    <w:rsid w:val="00451F0F"/>
     <w:rPr>
       <w:rFonts w:ascii="Linux Libertine" w:hAnsi="Linux Libertine" w:cs="Linux Libertine"/>
       <w:color w:val="074F6A" w:themeColor="accent4" w:themeShade="80"/>
@@ -5516,7 +5478,7 @@
     <w:link w:val="SubtitleChar"/>
     <w:uiPriority w:val="11"/>
     <w:qFormat/>
-    <w:rsid w:val="0011037F"/>
+    <w:rsid w:val="00451F0F"/>
     <w:pPr>
       <w:numPr>
         <w:ilvl w:val="1"/>
@@ -5536,7 +5498,7 @@
     <w:basedOn w:val="DefaultParagraphFont"/>
     <w:link w:val="Subtitle"/>
     <w:uiPriority w:val="11"/>
-    <w:rsid w:val="0011037F"/>
+    <w:rsid w:val="00451F0F"/>
     <w:rPr>
       <w:rFonts w:ascii="Linux Biolinum" w:eastAsiaTheme="majorEastAsia" w:hAnsi="Linux Biolinum" w:cs="Linux Biolinum"/>
       <w:iCs/>
@@ -5547,14 +5509,14 @@
     <w:name w:val="AltSubTitle"/>
     <w:basedOn w:val="Subtitle"/>
     <w:qFormat/>
-    <w:rsid w:val="0011037F"/>
+    <w:rsid w:val="00451F0F"/>
   </w:style>
   <w:style w:type="paragraph" w:customStyle="1" w:styleId="Titledocument">
     <w:name w:val="Title_document"/>
     <w:basedOn w:val="Heading1"/>
     <w:autoRedefine/>
     <w:qFormat/>
-    <w:rsid w:val="0011037F"/>
+    <w:rsid w:val="00451F0F"/>
     <w:pPr>
       <w:spacing w:before="100" w:after="100" w:line="240" w:lineRule="auto"/>
       <w:jc w:val="center"/>
@@ -5571,13 +5533,13 @@
     <w:name w:val="AltTitle"/>
     <w:basedOn w:val="Titledocument"/>
     <w:qFormat/>
-    <w:rsid w:val="0011037F"/>
+    <w:rsid w:val="00451F0F"/>
   </w:style>
   <w:style w:type="paragraph" w:customStyle="1" w:styleId="Appendix">
     <w:name w:val="Appendix"/>
     <w:link w:val="AppendixChar"/>
     <w:qFormat/>
-    <w:rsid w:val="0011037F"/>
+    <w:rsid w:val="00451F0F"/>
     <w:pPr>
       <w:spacing w:before="480" w:after="200" w:line="276" w:lineRule="auto"/>
     </w:pPr>
@@ -5593,7 +5555,7 @@
     <w:name w:val="Appendix Char"/>
     <w:basedOn w:val="DefaultParagraphFont"/>
     <w:link w:val="Appendix"/>
-    <w:rsid w:val="0011037F"/>
+    <w:rsid w:val="00451F0F"/>
     <w:rPr>
       <w:rFonts w:asciiTheme="majorHAnsi" w:eastAsiaTheme="minorHAnsi" w:hAnsiTheme="majorHAnsi"/>
       <w:color w:val="0E2841" w:themeColor="text2"/>
@@ -5605,7 +5567,7 @@
   <w:style w:type="paragraph" w:customStyle="1" w:styleId="AppendixH1">
     <w:name w:val="AppendixH1"/>
     <w:qFormat/>
-    <w:rsid w:val="0011037F"/>
+    <w:rsid w:val="00451F0F"/>
     <w:pPr>
       <w:spacing w:before="140" w:after="40" w:line="240" w:lineRule="auto"/>
     </w:pPr>
@@ -5620,7 +5582,7 @@
   <w:style w:type="paragraph" w:customStyle="1" w:styleId="AppendixH2">
     <w:name w:val="AppendixH2"/>
     <w:qFormat/>
-    <w:rsid w:val="0011037F"/>
+    <w:rsid w:val="00451F0F"/>
     <w:pPr>
       <w:autoSpaceDE w:val="0"/>
       <w:autoSpaceDN w:val="0"/>
@@ -5637,7 +5599,7 @@
   <w:style w:type="paragraph" w:customStyle="1" w:styleId="AppendixH3">
     <w:name w:val="AppendixH3"/>
     <w:qFormat/>
-    <w:rsid w:val="0011037F"/>
+    <w:rsid w:val="00451F0F"/>
     <w:pPr>
       <w:autoSpaceDE w:val="0"/>
       <w:autoSpaceDN w:val="0"/>
@@ -5657,7 +5619,7 @@
     <w:basedOn w:val="DefaultParagraphFont"/>
     <w:uiPriority w:val="1"/>
     <w:qFormat/>
-    <w:rsid w:val="0011037F"/>
+    <w:rsid w:val="00451F0F"/>
     <w:rPr>
       <w:rFonts w:ascii="Linux Libertine" w:hAnsi="Linux Libertine" w:cs="Linux Libertine"/>
       <w:color w:val="auto"/>
@@ -5668,7 +5630,7 @@
   <w:style w:type="paragraph" w:customStyle="1" w:styleId="AuthInfo">
     <w:name w:val="AuthInfo"/>
     <w:qFormat/>
-    <w:rsid w:val="0011037F"/>
+    <w:rsid w:val="00451F0F"/>
     <w:pPr>
       <w:spacing w:after="200" w:line="276" w:lineRule="auto"/>
     </w:pPr>
@@ -5682,7 +5644,7 @@
   <w:style w:type="paragraph" w:customStyle="1" w:styleId="AuthNotes">
     <w:name w:val="AuthNotes"/>
     <w:qFormat/>
-    <w:rsid w:val="0011037F"/>
+    <w:rsid w:val="00451F0F"/>
     <w:pPr>
       <w:spacing w:after="0" w:line="276" w:lineRule="auto"/>
     </w:pPr>
@@ -5698,7 +5660,7 @@
     <w:basedOn w:val="DefaultParagraphFont"/>
     <w:uiPriority w:val="1"/>
     <w:qFormat/>
-    <w:rsid w:val="0011037F"/>
+    <w:rsid w:val="00451F0F"/>
     <w:rPr>
       <w:color w:val="0F9ED5" w:themeColor="accent4"/>
     </w:rPr>
@@ -5708,7 +5670,7 @@
     <w:link w:val="AuthorsChar"/>
     <w:autoRedefine/>
     <w:qFormat/>
-    <w:rsid w:val="0011037F"/>
+    <w:rsid w:val="00451F0F"/>
     <w:pPr>
       <w:spacing w:before="180" w:after="60" w:line="240" w:lineRule="auto"/>
     </w:pPr>
@@ -5723,7 +5685,7 @@
     <w:name w:val="Authors Char"/>
     <w:basedOn w:val="DefaultParagraphFont"/>
     <w:link w:val="Authors"/>
-    <w:rsid w:val="0011037F"/>
+    <w:rsid w:val="00451F0F"/>
     <w:rPr>
       <w:rFonts w:ascii="Linux Libertine" w:eastAsiaTheme="minorHAnsi" w:hAnsi="Linux Libertine" w:cs="Linux Libertine"/>
       <w:kern w:val="0"/>
@@ -5735,7 +5697,7 @@
     <w:name w:val="Bib_entry"/>
     <w:autoRedefine/>
     <w:qFormat/>
-    <w:rsid w:val="0011037F"/>
+    <w:rsid w:val="00451F0F"/>
     <w:pPr>
       <w:spacing w:after="0" w:line="240" w:lineRule="auto"/>
     </w:pPr>
@@ -5749,7 +5711,7 @@
   <w:style w:type="character" w:customStyle="1" w:styleId="BookSeries">
     <w:name w:val="BookSeries"/>
     <w:uiPriority w:val="1"/>
-    <w:rsid w:val="0011037F"/>
+    <w:rsid w:val="00451F0F"/>
     <w:rPr>
       <w:rFonts w:ascii="Linux Libertine" w:hAnsi="Linux Libertine" w:cs="Linux Libertine"/>
     </w:rPr>
@@ -5759,7 +5721,7 @@
     <w:basedOn w:val="DefaultParagraphFont"/>
     <w:uiPriority w:val="1"/>
     <w:qFormat/>
-    <w:rsid w:val="0011037F"/>
+    <w:rsid w:val="00451F0F"/>
     <w:rPr>
       <w:rFonts w:ascii="Linux Libertine" w:hAnsi="Linux Libertine" w:cs="Linux Libertine"/>
       <w:color w:val="auto"/>
@@ -5772,7 +5734,7 @@
     <w:basedOn w:val="DefaultParagraphFont"/>
     <w:uiPriority w:val="1"/>
     <w:qFormat/>
-    <w:rsid w:val="0011037F"/>
+    <w:rsid w:val="00451F0F"/>
     <w:rPr>
       <w:rFonts w:ascii="Linux Libertine" w:hAnsi="Linux Libertine" w:cs="Linux Libertine"/>
       <w:color w:val="auto"/>
@@ -5783,14 +5745,14 @@
   <w:style w:type="character" w:customStyle="1" w:styleId="CJK">
     <w:name w:val="CJK"/>
     <w:uiPriority w:val="1"/>
-    <w:rsid w:val="0011037F"/>
+    <w:rsid w:val="00451F0F"/>
   </w:style>
   <w:style w:type="character" w:customStyle="1" w:styleId="Coden">
     <w:name w:val="Coden"/>
     <w:basedOn w:val="DefaultParagraphFont"/>
     <w:uiPriority w:val="1"/>
     <w:qFormat/>
-    <w:rsid w:val="0011037F"/>
+    <w:rsid w:val="00451F0F"/>
     <w:rPr>
       <w:rFonts w:ascii="Linux Libertine" w:hAnsi="Linux Libertine" w:cs="Linux Libertine"/>
       <w:color w:val="auto"/>
@@ -5803,7 +5765,7 @@
     <w:basedOn w:val="DefaultParagraphFont"/>
     <w:uiPriority w:val="1"/>
     <w:qFormat/>
-    <w:rsid w:val="0011037F"/>
+    <w:rsid w:val="00451F0F"/>
     <w:rPr>
       <w:rFonts w:ascii="Linux Libertine" w:hAnsi="Linux Libertine" w:cs="Linux Libertine"/>
       <w:color w:val="auto"/>
@@ -5815,7 +5777,7 @@
     <w:name w:val="ConfDate"/>
     <w:basedOn w:val="DefaultParagraphFont"/>
     <w:uiPriority w:val="1"/>
-    <w:rsid w:val="0011037F"/>
+    <w:rsid w:val="00451F0F"/>
     <w:rPr>
       <w:rFonts w:ascii="Times New Roman" w:hAnsi="Times New Roman"/>
       <w:color w:val="FF0066"/>
@@ -5826,7 +5788,7 @@
     <w:name w:val="ConfLoc"/>
     <w:basedOn w:val="DefaultParagraphFont"/>
     <w:uiPriority w:val="1"/>
-    <w:rsid w:val="0011037F"/>
+    <w:rsid w:val="00451F0F"/>
     <w:rPr>
       <w:rFonts w:ascii="Linux Libertine" w:hAnsi="Linux Libertine" w:cs="Linux Libertine"/>
       <w:color w:val="003300"/>
@@ -5839,7 +5801,7 @@
     <w:basedOn w:val="DefaultParagraphFont"/>
     <w:uiPriority w:val="1"/>
     <w:qFormat/>
-    <w:rsid w:val="0011037F"/>
+    <w:rsid w:val="00451F0F"/>
     <w:rPr>
       <w:rFonts w:ascii="Linux Libertine" w:hAnsi="Linux Libertine" w:cs="Linux Libertine"/>
       <w:color w:val="15BDBD"/>
@@ -5849,7 +5811,7 @@
     <w:name w:val="Contributor"/>
     <w:basedOn w:val="Normal"/>
     <w:qFormat/>
-    <w:rsid w:val="0011037F"/>
+    <w:rsid w:val="00451F0F"/>
     <w:pPr>
       <w:keepLines/>
       <w:spacing w:after="120" w:line="360" w:lineRule="exact"/>
@@ -5866,14 +5828,14 @@
     <w:name w:val="Copyright"/>
     <w:basedOn w:val="Normal"/>
     <w:qFormat/>
-    <w:rsid w:val="0011037F"/>
+    <w:rsid w:val="00451F0F"/>
   </w:style>
   <w:style w:type="character" w:customStyle="1" w:styleId="Correct">
     <w:name w:val="Correct"/>
     <w:basedOn w:val="DefaultParagraphFont"/>
     <w:uiPriority w:val="1"/>
     <w:qFormat/>
-    <w:rsid w:val="0011037F"/>
+    <w:rsid w:val="00451F0F"/>
     <w:rPr>
       <w:b/>
       <w:color w:val="0070C0"/>
@@ -5884,7 +5846,7 @@
     <w:basedOn w:val="DefaultParagraphFont"/>
     <w:uiPriority w:val="1"/>
     <w:qFormat/>
-    <w:rsid w:val="0011037F"/>
+    <w:rsid w:val="00451F0F"/>
     <w:rPr>
       <w:rFonts w:ascii="Linux Libertine" w:hAnsi="Linux Libertine" w:cs="Linux Libertine"/>
       <w:color w:val="auto"/>
@@ -5897,14 +5859,14 @@
     <w:basedOn w:val="DefaultParagraphFont"/>
     <w:uiPriority w:val="99"/>
     <w:semiHidden/>
-    <w:rsid w:val="0011037F"/>
+    <w:rsid w:val="00451F0F"/>
   </w:style>
   <w:style w:type="character" w:customStyle="1" w:styleId="Degree">
     <w:name w:val="Degree"/>
     <w:basedOn w:val="DefaultParagraphFont"/>
     <w:uiPriority w:val="1"/>
     <w:qFormat/>
-    <w:rsid w:val="0011037F"/>
+    <w:rsid w:val="00451F0F"/>
     <w:rPr>
       <w:rFonts w:ascii="Linux Libertine" w:hAnsi="Linux Libertine" w:cs="Linux Libertine"/>
       <w:color w:val="auto"/>
@@ -5916,7 +5878,7 @@
     <w:name w:val="Dictionary"/>
     <w:basedOn w:val="Normal"/>
     <w:qFormat/>
-    <w:rsid w:val="0011037F"/>
+    <w:rsid w:val="00451F0F"/>
     <w:pPr>
       <w:tabs>
         <w:tab w:val="right" w:pos="720"/>
@@ -5939,7 +5901,7 @@
     <w:name w:val="DisplayFormula"/>
     <w:link w:val="DisplayFormulaChar"/>
     <w:qFormat/>
-    <w:rsid w:val="0011037F"/>
+    <w:rsid w:val="00451F0F"/>
     <w:pPr>
       <w:spacing w:before="100" w:after="100" w:line="240" w:lineRule="auto"/>
     </w:pPr>
@@ -5954,7 +5916,7 @@
     <w:name w:val="DisplayFormula Char"/>
     <w:basedOn w:val="DefaultParagraphFont"/>
     <w:link w:val="DisplayFormula"/>
-    <w:rsid w:val="0011037F"/>
+    <w:rsid w:val="00451F0F"/>
     <w:rPr>
       <w:rFonts w:ascii="Linux Libertine" w:eastAsiaTheme="minorHAnsi" w:hAnsi="Linux Libertine" w:cs="Linux Libertine"/>
       <w:kern w:val="0"/>
@@ -5966,13 +5928,13 @@
     <w:name w:val="DisplayFormulaUnnum"/>
     <w:basedOn w:val="Normal"/>
     <w:link w:val="DisplayFormulaUnnumChar"/>
-    <w:rsid w:val="0011037F"/>
+    <w:rsid w:val="00451F0F"/>
   </w:style>
   <w:style w:type="character" w:customStyle="1" w:styleId="DisplayFormulaUnnumChar">
     <w:name w:val="DisplayFormulaUnnum Char"/>
     <w:basedOn w:val="DefaultParagraphFont"/>
     <w:link w:val="DisplayFormulaUnnum"/>
-    <w:rsid w:val="0011037F"/>
+    <w:rsid w:val="00451F0F"/>
     <w:rPr>
       <w:rFonts w:ascii="Linux Libertine" w:eastAsiaTheme="minorHAnsi" w:hAnsi="Linux Libertine" w:cs="Linux Libertine"/>
       <w:kern w:val="0"/>
@@ -5985,7 +5947,7 @@
     <w:basedOn w:val="Normal"/>
     <w:autoRedefine/>
     <w:qFormat/>
-    <w:rsid w:val="0011037F"/>
+    <w:rsid w:val="00451F0F"/>
     <w:pPr>
       <w:pBdr>
         <w:top w:val="single" w:sz="4" w:space="1" w:color="auto"/>
@@ -6004,7 +5966,7 @@
     <w:basedOn w:val="DefaultParagraphFont"/>
     <w:uiPriority w:val="1"/>
     <w:qFormat/>
-    <w:rsid w:val="0011037F"/>
+    <w:rsid w:val="00451F0F"/>
     <w:rPr>
       <w:rFonts w:ascii="Linux Libertine" w:hAnsi="Linux Libertine" w:cs="Linux Libertine"/>
       <w:color w:val="auto"/>
@@ -6017,7 +5979,7 @@
     <w:basedOn w:val="DefaultParagraphFont"/>
     <w:uiPriority w:val="1"/>
     <w:qFormat/>
-    <w:rsid w:val="0011037F"/>
+    <w:rsid w:val="00451F0F"/>
     <w:rPr>
       <w:rFonts w:ascii="Linux Libertine" w:hAnsi="Linux Libertine" w:cs="Linux Libertine"/>
       <w:color w:val="auto"/>
@@ -6030,7 +5992,7 @@
     <w:basedOn w:val="DefaultParagraphFont"/>
     <w:uiPriority w:val="1"/>
     <w:qFormat/>
-    <w:rsid w:val="0011037F"/>
+    <w:rsid w:val="00451F0F"/>
     <w:rPr>
       <w:rFonts w:ascii="Linux Libertine" w:hAnsi="Linux Libertine" w:cs="Linux Libertine"/>
       <w:color w:val="auto"/>
@@ -6042,7 +6004,7 @@
     <w:name w:val="EdMiddleName"/>
     <w:basedOn w:val="DefaultParagraphFont"/>
     <w:uiPriority w:val="1"/>
-    <w:rsid w:val="0011037F"/>
+    <w:rsid w:val="00451F0F"/>
     <w:rPr>
       <w:rFonts w:ascii="Linux Libertine" w:hAnsi="Linux Libertine" w:cs="Linux Libertine"/>
       <w:bdr w:val="none" w:sz="0" w:space="0" w:color="auto"/>
@@ -6054,7 +6016,7 @@
     <w:basedOn w:val="DefaultParagraphFont"/>
     <w:uiPriority w:val="1"/>
     <w:qFormat/>
-    <w:rsid w:val="0011037F"/>
+    <w:rsid w:val="00451F0F"/>
     <w:rPr>
       <w:rFonts w:ascii="Linux Libertine" w:hAnsi="Linux Libertine" w:cs="Linux Libertine"/>
       <w:color w:val="auto"/>
@@ -6067,7 +6029,7 @@
     <w:basedOn w:val="DefaultParagraphFont"/>
     <w:uiPriority w:val="1"/>
     <w:qFormat/>
-    <w:rsid w:val="0011037F"/>
+    <w:rsid w:val="00451F0F"/>
     <w:rPr>
       <w:rFonts w:ascii="Linux Libertine" w:hAnsi="Linux Libertine" w:cs="Linux Libertine"/>
       <w:color w:val="0808B8"/>
@@ -6079,7 +6041,7 @@
     <w:uiPriority w:val="99"/>
     <w:semiHidden/>
     <w:unhideWhenUsed/>
-    <w:rsid w:val="0011037F"/>
+    <w:rsid w:val="00451F0F"/>
     <w:rPr>
       <w:rFonts w:ascii="Linux Libertine" w:hAnsi="Linux Libertine" w:cs="Linux Libertine"/>
       <w:vertAlign w:val="superscript"/>
@@ -6092,7 +6054,7 @@
     <w:uiPriority w:val="99"/>
     <w:semiHidden/>
     <w:unhideWhenUsed/>
-    <w:rsid w:val="0011037F"/>
+    <w:rsid w:val="00451F0F"/>
     <w:rPr>
       <w:sz w:val="20"/>
       <w:szCs w:val="20"/>
@@ -6104,7 +6066,7 @@
     <w:link w:val="EndnoteText"/>
     <w:uiPriority w:val="99"/>
     <w:semiHidden/>
-    <w:rsid w:val="0011037F"/>
+    <w:rsid w:val="00451F0F"/>
     <w:rPr>
       <w:rFonts w:ascii="Linux Libertine" w:eastAsiaTheme="minorHAnsi" w:hAnsi="Linux Libertine" w:cs="Linux Libertine"/>
       <w:kern w:val="0"/>
@@ -6117,7 +6079,7 @@
     <w:basedOn w:val="DefaultParagraphFont"/>
     <w:uiPriority w:val="1"/>
     <w:qFormat/>
-    <w:rsid w:val="0011037F"/>
+    <w:rsid w:val="00451F0F"/>
     <w:rPr>
       <w:color w:val="0000FF"/>
     </w:rPr>
@@ -6127,7 +6089,7 @@
     <w:basedOn w:val="DefaultParagraphFont"/>
     <w:uiPriority w:val="1"/>
     <w:qFormat/>
-    <w:rsid w:val="0011037F"/>
+    <w:rsid w:val="00451F0F"/>
     <w:rPr>
       <w:color w:val="FF0000"/>
     </w:rPr>
@@ -6135,7 +6097,7 @@
   <w:style w:type="paragraph" w:customStyle="1" w:styleId="Extract">
     <w:name w:val="Extract"/>
     <w:basedOn w:val="Normal"/>
-    <w:rsid w:val="0011037F"/>
+    <w:rsid w:val="00451F0F"/>
     <w:pPr>
       <w:spacing w:line="240" w:lineRule="auto"/>
       <w:ind w:left="360" w:right="360"/>
@@ -6151,7 +6113,7 @@
     <w:name w:val="ExtractBegin"/>
     <w:basedOn w:val="Normal"/>
     <w:qFormat/>
-    <w:rsid w:val="0011037F"/>
+    <w:rsid w:val="00451F0F"/>
     <w:pPr>
       <w:pBdr>
         <w:top w:val="dashed" w:sz="12" w:space="1" w:color="auto"/>
@@ -6174,7 +6136,7 @@
     <w:name w:val="ExtractEnd"/>
     <w:basedOn w:val="Normal"/>
     <w:qFormat/>
-    <w:rsid w:val="0011037F"/>
+    <w:rsid w:val="00451F0F"/>
     <w:pPr>
       <w:pBdr>
         <w:left w:val="dashed" w:sz="12" w:space="4" w:color="auto"/>
@@ -6198,7 +6160,7 @@
     <w:basedOn w:val="DefaultParagraphFont"/>
     <w:uiPriority w:val="1"/>
     <w:qFormat/>
-    <w:rsid w:val="0011037F"/>
+    <w:rsid w:val="00451F0F"/>
     <w:rPr>
       <w:rFonts w:ascii="Linux Libertine" w:hAnsi="Linux Libertine" w:cs="Linux Libertine"/>
       <w:color w:val="C00000"/>
@@ -6209,7 +6171,7 @@
     <w:basedOn w:val="DefaultParagraphFont"/>
     <w:uiPriority w:val="1"/>
     <w:qFormat/>
-    <w:rsid w:val="0011037F"/>
+    <w:rsid w:val="00451F0F"/>
     <w:rPr>
       <w:color w:val="0000FF"/>
     </w:rPr>
@@ -6219,13 +6181,13 @@
     <w:basedOn w:val="Normal"/>
     <w:link w:val="TableFootnoteChar"/>
     <w:qFormat/>
-    <w:rsid w:val="0011037F"/>
+    <w:rsid w:val="00451F0F"/>
   </w:style>
   <w:style w:type="character" w:customStyle="1" w:styleId="TableFootnoteChar">
     <w:name w:val="TableFootnote Char"/>
     <w:basedOn w:val="DefaultParagraphFont"/>
     <w:link w:val="TableFootnote"/>
-    <w:rsid w:val="0011037F"/>
+    <w:rsid w:val="00451F0F"/>
     <w:rPr>
       <w:rFonts w:ascii="Linux Libertine" w:eastAsiaTheme="minorHAnsi" w:hAnsi="Linux Libertine" w:cs="Linux Libertine"/>
       <w:kern w:val="0"/>
@@ -6238,7 +6200,7 @@
     <w:link w:val="FigureCaptionChar"/>
     <w:autoRedefine/>
     <w:qFormat/>
-    <w:rsid w:val="0011037F"/>
+    <w:rsid w:val="00451F0F"/>
     <w:pPr>
       <w:spacing w:before="220" w:after="240" w:line="240" w:lineRule="auto"/>
       <w:jc w:val="center"/>
@@ -6255,7 +6217,7 @@
     <w:name w:val="FigureCaption Char"/>
     <w:basedOn w:val="DefaultParagraphFont"/>
     <w:link w:val="FigureCaption"/>
-    <w:rsid w:val="0011037F"/>
+    <w:rsid w:val="00451F0F"/>
     <w:rPr>
       <w:rFonts w:ascii="Linux Libertine" w:eastAsiaTheme="minorHAnsi" w:hAnsi="Linux Libertine" w:cs="Linux Libertine"/>
       <w:b/>
@@ -6269,7 +6231,7 @@
     <w:basedOn w:val="DefaultParagraphFont"/>
     <w:uiPriority w:val="1"/>
     <w:qFormat/>
-    <w:rsid w:val="0011037F"/>
+    <w:rsid w:val="00451F0F"/>
     <w:rPr>
       <w:rFonts w:ascii="Linux Libertine" w:hAnsi="Linux Libertine" w:cs="Linux Libertine"/>
       <w:color w:val="auto"/>
@@ -6281,7 +6243,7 @@
     <w:name w:val="FloatQuote"/>
     <w:basedOn w:val="Para"/>
     <w:qFormat/>
-    <w:rsid w:val="0011037F"/>
+    <w:rsid w:val="00451F0F"/>
     <w:pPr>
       <w:shd w:val="clear" w:color="auto" w:fill="D9F2D0" w:themeFill="accent6" w:themeFillTint="33"/>
       <w:ind w:left="1134" w:right="1134" w:firstLine="0"/>
@@ -6291,7 +6253,7 @@
   <w:style w:type="character" w:customStyle="1" w:styleId="focus">
     <w:name w:val="focus"/>
     <w:basedOn w:val="DefaultParagraphFont"/>
-    <w:rsid w:val="0011037F"/>
+    <w:rsid w:val="00451F0F"/>
   </w:style>
   <w:style w:type="character" w:styleId="FollowedHyperlink">
     <w:name w:val="FollowedHyperlink"/>
@@ -6299,7 +6261,7 @@
     <w:uiPriority w:val="99"/>
     <w:semiHidden/>
     <w:unhideWhenUsed/>
-    <w:rsid w:val="0011037F"/>
+    <w:rsid w:val="00451F0F"/>
     <w:rPr>
       <w:rFonts w:ascii="Linux Libertine" w:hAnsi="Linux Libertine" w:cs="Linux Libertine"/>
       <w:color w:val="96607D" w:themeColor="followedHyperlink"/>
@@ -6311,7 +6273,7 @@
     <w:basedOn w:val="DefaultParagraphFont"/>
     <w:uiPriority w:val="1"/>
     <w:qFormat/>
-    <w:rsid w:val="0011037F"/>
+    <w:rsid w:val="00451F0F"/>
     <w:rPr>
       <w:rFonts w:ascii="Linux Libertine" w:hAnsi="Linux Libertine" w:cs="Linux Libertine"/>
       <w:color w:val="9900FF"/>
@@ -6322,7 +6284,7 @@
     <w:basedOn w:val="DefaultParagraphFont"/>
     <w:uiPriority w:val="1"/>
     <w:qFormat/>
-    <w:rsid w:val="0011037F"/>
+    <w:rsid w:val="00451F0F"/>
     <w:rPr>
       <w:rFonts w:ascii="Linux Libertine" w:hAnsi="Linux Libertine" w:cs="Linux Libertine"/>
       <w:color w:val="666699"/>
@@ -6334,7 +6296,7 @@
     <w:next w:val="Para"/>
     <w:autoRedefine/>
     <w:qFormat/>
-    <w:rsid w:val="0011037F"/>
+    <w:rsid w:val="00451F0F"/>
     <w:pPr>
       <w:numPr>
         <w:ilvl w:val="1"/>
@@ -6353,7 +6315,7 @@
     <w:next w:val="Para"/>
     <w:autoRedefine/>
     <w:qFormat/>
-    <w:rsid w:val="0011037F"/>
+    <w:rsid w:val="00451F0F"/>
     <w:pPr>
       <w:keepNext/>
       <w:numPr>
@@ -6374,7 +6336,7 @@
     <w:name w:val="Head4"/>
     <w:autoRedefine/>
     <w:qFormat/>
-    <w:rsid w:val="0011037F"/>
+    <w:rsid w:val="00451F0F"/>
     <w:pPr>
       <w:keepNext/>
       <w:numPr>
@@ -6394,7 +6356,7 @@
     <w:name w:val="Head5"/>
     <w:autoRedefine/>
     <w:qFormat/>
-    <w:rsid w:val="0011037F"/>
+    <w:rsid w:val="00451F0F"/>
     <w:pPr>
       <w:spacing w:before="120" w:after="120" w:line="240" w:lineRule="auto"/>
     </w:pPr>
@@ -6408,7 +6370,7 @@
   <w:style w:type="paragraph" w:customStyle="1" w:styleId="Head6">
     <w:name w:val="Head6"/>
     <w:basedOn w:val="Normal"/>
-    <w:rsid w:val="0011037F"/>
+    <w:rsid w:val="00451F0F"/>
     <w:pPr>
       <w:keepNext/>
       <w:keepLines/>
@@ -6428,14 +6390,14 @@
     <w:basedOn w:val="Normal"/>
     <w:autoRedefine/>
     <w:qFormat/>
-    <w:rsid w:val="0011037F"/>
+    <w:rsid w:val="00451F0F"/>
   </w:style>
   <w:style w:type="character" w:customStyle="1" w:styleId="Isbn">
     <w:name w:val="Isbn"/>
     <w:basedOn w:val="DefaultParagraphFont"/>
     <w:uiPriority w:val="1"/>
     <w:qFormat/>
-    <w:rsid w:val="0011037F"/>
+    <w:rsid w:val="00451F0F"/>
     <w:rPr>
       <w:rFonts w:ascii="Linux Libertine" w:hAnsi="Linux Libertine" w:cs="Linux Libertine"/>
       <w:bdr w:val="none" w:sz="0" w:space="0" w:color="auto"/>
@@ -6447,7 +6409,7 @@
     <w:basedOn w:val="DefaultParagraphFont"/>
     <w:uiPriority w:val="1"/>
     <w:qFormat/>
-    <w:rsid w:val="0011037F"/>
+    <w:rsid w:val="00451F0F"/>
     <w:rPr>
       <w:rFonts w:ascii="Linux Libertine" w:hAnsi="Linux Libertine" w:cs="Linux Libertine"/>
       <w:b w:val="0"/>
@@ -6459,7 +6421,7 @@
     <w:basedOn w:val="Label"/>
     <w:uiPriority w:val="1"/>
     <w:qFormat/>
-    <w:rsid w:val="0011037F"/>
+    <w:rsid w:val="00451F0F"/>
     <w:rPr>
       <w:rFonts w:ascii="Linux Biolinum" w:hAnsi="Linux Biolinum" w:cs="Linux Biolinum"/>
       <w:b/>
@@ -6472,7 +6434,7 @@
     <w:basedOn w:val="ListTitle"/>
     <w:uiPriority w:val="1"/>
     <w:qFormat/>
-    <w:rsid w:val="0011037F"/>
+    <w:rsid w:val="00451F0F"/>
     <w:rPr>
       <w:rFonts w:ascii="Linux Biolinum" w:hAnsi="Linux Biolinum" w:cs="Linux Biolinum"/>
       <w:b/>
@@ -6485,7 +6447,7 @@
     <w:basedOn w:val="DefaultParagraphFont"/>
     <w:uiPriority w:val="1"/>
     <w:qFormat/>
-    <w:rsid w:val="0011037F"/>
+    <w:rsid w:val="00451F0F"/>
     <w:rPr>
       <w:rFonts w:ascii="Linux Libertine" w:hAnsi="Linux Libertine" w:cs="Linux Libertine"/>
       <w:bdr w:val="none" w:sz="0" w:space="0" w:color="auto"/>
@@ -6497,7 +6459,7 @@
     <w:basedOn w:val="DefaultParagraphFont"/>
     <w:uiPriority w:val="1"/>
     <w:qFormat/>
-    <w:rsid w:val="0011037F"/>
+    <w:rsid w:val="00451F0F"/>
     <w:rPr>
       <w:rFonts w:ascii="Linux Libertine" w:hAnsi="Linux Libertine" w:cs="Linux Libertine"/>
       <w:color w:val="auto"/>
@@ -6510,7 +6472,7 @@
     <w:basedOn w:val="DefaultParagraphFont"/>
     <w:uiPriority w:val="1"/>
     <w:qFormat/>
-    <w:rsid w:val="0011037F"/>
+    <w:rsid w:val="00451F0F"/>
     <w:rPr>
       <w:rFonts w:ascii="Linux Libertine" w:hAnsi="Linux Libertine" w:cs="Linux Libertine"/>
       <w:color w:val="auto"/>
@@ -6522,7 +6484,7 @@
     <w:name w:val="KeyWordHead"/>
     <w:autoRedefine/>
     <w:qFormat/>
-    <w:rsid w:val="0011037F"/>
+    <w:rsid w:val="00451F0F"/>
     <w:pPr>
       <w:keepNext/>
       <w:spacing w:before="200" w:after="20" w:line="240" w:lineRule="auto"/>
@@ -6539,7 +6501,7 @@
     <w:name w:val="KeyWords"/>
     <w:basedOn w:val="Normal"/>
     <w:qFormat/>
-    <w:rsid w:val="0011037F"/>
+    <w:rsid w:val="00451F0F"/>
     <w:pPr>
       <w:spacing w:before="60" w:after="60"/>
     </w:pPr>
@@ -6549,7 +6511,7 @@
     <w:autoRedefine/>
     <w:uiPriority w:val="34"/>
     <w:qFormat/>
-    <w:rsid w:val="0011037F"/>
+    <w:rsid w:val="00451F0F"/>
     <w:pPr>
       <w:numPr>
         <w:numId w:val="12"/>
@@ -6568,18 +6530,18 @@
     <w:name w:val="ListEnd"/>
     <w:basedOn w:val="Normal"/>
     <w:qFormat/>
-    <w:rsid w:val="0011037F"/>
+    <w:rsid w:val="00451F0F"/>
   </w:style>
   <w:style w:type="paragraph" w:customStyle="1" w:styleId="ListStart">
     <w:name w:val="ListStart"/>
     <w:basedOn w:val="Normal"/>
     <w:qFormat/>
-    <w:rsid w:val="0011037F"/>
+    <w:rsid w:val="00451F0F"/>
   </w:style>
   <w:style w:type="paragraph" w:customStyle="1" w:styleId="MetadataHead">
     <w:name w:val="MetadataHead"/>
     <w:basedOn w:val="Normal"/>
-    <w:rsid w:val="0011037F"/>
+    <w:rsid w:val="00451F0F"/>
     <w:rPr>
       <w:color w:val="2C7FCE" w:themeColor="text2" w:themeTint="99"/>
       <w:sz w:val="2"/>
@@ -6590,7 +6552,7 @@
     <w:basedOn w:val="DefaultParagraphFont"/>
     <w:uiPriority w:val="1"/>
     <w:qFormat/>
-    <w:rsid w:val="0011037F"/>
+    <w:rsid w:val="00451F0F"/>
     <w:rPr>
       <w:rFonts w:ascii="Linux Libertine" w:hAnsi="Linux Libertine" w:cs="Linux Libertine"/>
       <w:color w:val="auto"/>
@@ -6603,7 +6565,7 @@
     <w:basedOn w:val="DefaultParagraphFont"/>
     <w:uiPriority w:val="1"/>
     <w:qFormat/>
-    <w:rsid w:val="0011037F"/>
+    <w:rsid w:val="00451F0F"/>
     <w:rPr>
       <w:rFonts w:ascii="Linux Libertine" w:hAnsi="Linux Libertine" w:cs="Linux Libertine"/>
       <w:color w:val="7030A0"/>
@@ -6614,7 +6576,7 @@
     <w:basedOn w:val="DefaultParagraphFont"/>
     <w:uiPriority w:val="1"/>
     <w:qFormat/>
-    <w:rsid w:val="0011037F"/>
+    <w:rsid w:val="00451F0F"/>
     <w:rPr>
       <w:rFonts w:ascii="Linux Libertine" w:hAnsi="Linux Libertine" w:cs="Linux Libertine"/>
       <w:color w:val="7030A0"/>
@@ -6625,7 +6587,7 @@
     <w:basedOn w:val="DefaultParagraphFont"/>
     <w:uiPriority w:val="1"/>
     <w:qFormat/>
-    <w:rsid w:val="0011037F"/>
+    <w:rsid w:val="00451F0F"/>
     <w:rPr>
       <w:rFonts w:ascii="Linux Libertine" w:hAnsi="Linux Libertine" w:cs="Linux Libertine"/>
       <w:color w:val="auto"/>
@@ -6636,7 +6598,7 @@
     <w:basedOn w:val="DefaultParagraphFont"/>
     <w:uiPriority w:val="1"/>
     <w:qFormat/>
-    <w:rsid w:val="0011037F"/>
+    <w:rsid w:val="00451F0F"/>
     <w:rPr>
       <w:rFonts w:ascii="Linux Libertine" w:hAnsi="Linux Libertine" w:cs="Linux Libertine"/>
       <w:color w:val="auto"/>
@@ -6647,7 +6609,7 @@
     <w:basedOn w:val="DefaultParagraphFont"/>
     <w:uiPriority w:val="1"/>
     <w:qFormat/>
-    <w:rsid w:val="0011037F"/>
+    <w:rsid w:val="00451F0F"/>
     <w:rPr>
       <w:rFonts w:ascii="Linux Libertine" w:hAnsi="Linux Libertine" w:cs="Linux Libertine"/>
       <w:color w:val="auto"/>
@@ -6659,7 +6621,7 @@
     <w:name w:val="ParaContinue"/>
     <w:basedOn w:val="Para"/>
     <w:link w:val="ParaContinueChar"/>
-    <w:rsid w:val="0011037F"/>
+    <w:rsid w:val="00451F0F"/>
     <w:pPr>
       <w:ind w:firstLine="0"/>
     </w:pPr>
@@ -6668,7 +6630,7 @@
     <w:name w:val="ParaContinue Char"/>
     <w:basedOn w:val="DefaultParagraphFont"/>
     <w:link w:val="ParaContinue"/>
-    <w:rsid w:val="0011037F"/>
+    <w:rsid w:val="00451F0F"/>
     <w:rPr>
       <w:rFonts w:ascii="Linux Libertine" w:eastAsiaTheme="minorHAnsi" w:hAnsi="Linux Libertine" w:cs="Linux Libertine"/>
       <w:kern w:val="0"/>
@@ -6681,7 +6643,7 @@
     <w:basedOn w:val="DefaultParagraphFont"/>
     <w:uiPriority w:val="1"/>
     <w:qFormat/>
-    <w:rsid w:val="0011037F"/>
+    <w:rsid w:val="00451F0F"/>
     <w:rPr>
       <w:rFonts w:ascii="Linux Libertine" w:hAnsi="Linux Libertine" w:cs="Linux Libertine"/>
       <w:color w:val="808000"/>
@@ -6692,7 +6654,7 @@
     <w:basedOn w:val="DefaultParagraphFont"/>
     <w:uiPriority w:val="99"/>
     <w:semiHidden/>
-    <w:rsid w:val="0011037F"/>
+    <w:rsid w:val="00451F0F"/>
     <w:rPr>
       <w:rFonts w:ascii="Linux Libertine" w:hAnsi="Linux Libertine" w:cs="Linux Libertine"/>
       <w:color w:val="808080"/>
@@ -6703,7 +6665,7 @@
     <w:basedOn w:val="DefaultParagraphFont"/>
     <w:uiPriority w:val="1"/>
     <w:qFormat/>
-    <w:rsid w:val="0011037F"/>
+    <w:rsid w:val="00451F0F"/>
     <w:rPr>
       <w:rFonts w:ascii="Linux Libertine" w:hAnsi="Linux Libertine" w:cs="Linux Libertine"/>
       <w:color w:val="auto"/>
@@ -6716,7 +6678,7 @@
     <w:basedOn w:val="DefaultParagraphFont"/>
     <w:uiPriority w:val="1"/>
     <w:qFormat/>
-    <w:rsid w:val="0011037F"/>
+    <w:rsid w:val="00451F0F"/>
     <w:rPr>
       <w:rFonts w:ascii="Linux Libertine" w:hAnsi="Linux Libertine" w:cs="Linux Libertine"/>
       <w:color w:val="auto"/>
@@ -6729,7 +6691,7 @@
     <w:basedOn w:val="DefaultParagraphFont"/>
     <w:uiPriority w:val="1"/>
     <w:qFormat/>
-    <w:rsid w:val="0011037F"/>
+    <w:rsid w:val="00451F0F"/>
     <w:rPr>
       <w:rFonts w:ascii="Linux Libertine" w:hAnsi="Linux Libertine" w:cs="Linux Libertine"/>
       <w:color w:val="auto"/>
@@ -6741,7 +6703,7 @@
     <w:name w:val="PullQuote"/>
     <w:basedOn w:val="Para"/>
     <w:qFormat/>
-    <w:rsid w:val="0011037F"/>
+    <w:rsid w:val="00451F0F"/>
     <w:pPr>
       <w:shd w:val="clear" w:color="auto" w:fill="C1F0C7" w:themeFill="accent3" w:themeFillTint="33"/>
       <w:ind w:left="1134" w:right="1134" w:firstLine="0"/>
@@ -6752,7 +6714,7 @@
     <w:name w:val="Quotation"/>
     <w:basedOn w:val="Normal"/>
     <w:qFormat/>
-    <w:rsid w:val="0011037F"/>
+    <w:rsid w:val="00451F0F"/>
     <w:pPr>
       <w:jc w:val="center"/>
     </w:pPr>
@@ -6765,7 +6727,7 @@
     <w:basedOn w:val="DefaultParagraphFont"/>
     <w:uiPriority w:val="1"/>
     <w:qFormat/>
-    <w:rsid w:val="0011037F"/>
+    <w:rsid w:val="00451F0F"/>
     <w:rPr>
       <w:rFonts w:ascii="Linux Libertine" w:hAnsi="Linux Libertine" w:cs="Linux Libertine"/>
       <w:color w:val="00B050"/>
@@ -6775,7 +6737,7 @@
     <w:name w:val="Recto_(RRH)"/>
     <w:autoRedefine/>
     <w:qFormat/>
-    <w:rsid w:val="0011037F"/>
+    <w:rsid w:val="00451F0F"/>
     <w:pPr>
       <w:spacing w:after="0" w:line="240" w:lineRule="auto"/>
       <w:jc w:val="right"/>
@@ -6792,7 +6754,7 @@
     <w:basedOn w:val="DefaultParagraphFont"/>
     <w:uiPriority w:val="1"/>
     <w:qFormat/>
-    <w:rsid w:val="0011037F"/>
+    <w:rsid w:val="00451F0F"/>
     <w:rPr>
       <w:color w:val="0000FF"/>
     </w:rPr>
@@ -6801,13 +6763,13 @@
     <w:name w:val="Reference"/>
     <w:basedOn w:val="Normal"/>
     <w:qFormat/>
-    <w:rsid w:val="0011037F"/>
+    <w:rsid w:val="00451F0F"/>
   </w:style>
   <w:style w:type="paragraph" w:customStyle="1" w:styleId="ReferenceHead">
     <w:name w:val="ReferenceHead"/>
     <w:autoRedefine/>
     <w:qFormat/>
-    <w:rsid w:val="0011037F"/>
+    <w:rsid w:val="00451F0F"/>
     <w:pPr>
       <w:keepNext/>
       <w:spacing w:before="200" w:after="40" w:line="240" w:lineRule="auto"/>
@@ -6825,7 +6787,7 @@
     <w:basedOn w:val="DefaultParagraphFont"/>
     <w:uiPriority w:val="1"/>
     <w:qFormat/>
-    <w:rsid w:val="0011037F"/>
+    <w:rsid w:val="00451F0F"/>
     <w:rPr>
       <w:rFonts w:ascii="Linux Libertine" w:hAnsi="Linux Libertine" w:cs="Linux Libertine"/>
       <w:color w:val="auto"/>
@@ -6838,7 +6800,7 @@
     <w:basedOn w:val="DefaultParagraphFont"/>
     <w:uiPriority w:val="1"/>
     <w:qFormat/>
-    <w:rsid w:val="0011037F"/>
+    <w:rsid w:val="00451F0F"/>
     <w:rPr>
       <w:rFonts w:ascii="Linux Libertine" w:hAnsi="Linux Libertine" w:cs="Linux Libertine"/>
       <w:bdr w:val="none" w:sz="0" w:space="0" w:color="auto"/>
@@ -6850,7 +6812,7 @@
     <w:basedOn w:val="DefaultParagraphFont"/>
     <w:uiPriority w:val="1"/>
     <w:qFormat/>
-    <w:rsid w:val="0011037F"/>
+    <w:rsid w:val="00451F0F"/>
     <w:rPr>
       <w:rFonts w:ascii="Linux Libertine" w:hAnsi="Linux Libertine" w:cs="Linux Libertine"/>
       <w:color w:val="0070C0"/>
@@ -6861,7 +6823,7 @@
     <w:basedOn w:val="DefaultParagraphFont"/>
     <w:uiPriority w:val="1"/>
     <w:qFormat/>
-    <w:rsid w:val="0011037F"/>
+    <w:rsid w:val="00451F0F"/>
     <w:rPr>
       <w:rFonts w:ascii="Linux Libertine" w:hAnsi="Linux Libertine" w:cs="Linux Libertine"/>
       <w:color w:val="0B769F" w:themeColor="accent4" w:themeShade="BF"/>
@@ -6872,7 +6834,7 @@
     <w:basedOn w:val="DefaultParagraphFont"/>
     <w:uiPriority w:val="1"/>
     <w:qFormat/>
-    <w:rsid w:val="0011037F"/>
+    <w:rsid w:val="00451F0F"/>
     <w:rPr>
       <w:rFonts w:ascii="Linux Libertine" w:hAnsi="Linux Libertine" w:cs="Linux Libertine"/>
       <w:color w:val="3A7C22" w:themeColor="accent6" w:themeShade="BF"/>
@@ -6883,7 +6845,7 @@
     <w:basedOn w:val="DefaultParagraphFont"/>
     <w:uiPriority w:val="1"/>
     <w:qFormat/>
-    <w:rsid w:val="0011037F"/>
+    <w:rsid w:val="00451F0F"/>
     <w:rPr>
       <w:rFonts w:ascii="Linux Libertine" w:hAnsi="Linux Libertine" w:cs="Linux Libertine"/>
       <w:color w:val="92D050"/>
@@ -6897,7 +6859,7 @@
     <w:uiPriority w:val="99"/>
     <w:semiHidden/>
     <w:unhideWhenUsed/>
-    <w:rsid w:val="0011037F"/>
+    <w:rsid w:val="00451F0F"/>
   </w:style>
   <w:style w:type="character" w:customStyle="1" w:styleId="SalutationChar">
     <w:name w:val="Salutation Char"/>
@@ -6905,7 +6867,7 @@
     <w:link w:val="Salutation"/>
     <w:uiPriority w:val="99"/>
     <w:semiHidden/>
-    <w:rsid w:val="0011037F"/>
+    <w:rsid w:val="00451F0F"/>
     <w:rPr>
       <w:rFonts w:ascii="Linux Libertine" w:eastAsiaTheme="minorHAnsi" w:hAnsi="Linux Libertine" w:cs="Linux Libertine"/>
       <w:kern w:val="0"/>
@@ -6917,13 +6879,13 @@
     <w:name w:val="SelfCitation"/>
     <w:basedOn w:val="Para"/>
     <w:qFormat/>
-    <w:rsid w:val="0011037F"/>
+    <w:rsid w:val="00451F0F"/>
   </w:style>
   <w:style w:type="paragraph" w:customStyle="1" w:styleId="Source">
     <w:name w:val="Source"/>
     <w:basedOn w:val="Normal"/>
     <w:qFormat/>
-    <w:rsid w:val="0011037F"/>
+    <w:rsid w:val="00451F0F"/>
     <w:pPr>
       <w:spacing w:after="200" w:line="276" w:lineRule="auto"/>
       <w:ind w:left="720"/>
@@ -6938,7 +6900,7 @@
     <w:name w:val="Spine"/>
     <w:basedOn w:val="Normal"/>
     <w:qFormat/>
-    <w:rsid w:val="0011037F"/>
+    <w:rsid w:val="00451F0F"/>
     <w:pPr>
       <w:pBdr>
         <w:top w:val="thinThickLargeGap" w:sz="24" w:space="8" w:color="auto"/>
@@ -6958,7 +6920,7 @@
     <w:basedOn w:val="DefaultParagraphFont"/>
     <w:uiPriority w:val="1"/>
     <w:qFormat/>
-    <w:rsid w:val="0011037F"/>
+    <w:rsid w:val="00451F0F"/>
     <w:rPr>
       <w:rFonts w:ascii="Linux Libertine" w:hAnsi="Linux Libertine" w:cs="Linux Libertine"/>
       <w:color w:val="auto"/>
@@ -6968,7 +6930,7 @@
     <w:name w:val="Statements"/>
     <w:basedOn w:val="Normal"/>
     <w:qFormat/>
-    <w:rsid w:val="0011037F"/>
+    <w:rsid w:val="00451F0F"/>
     <w:pPr>
       <w:ind w:firstLine="240"/>
     </w:pPr>
@@ -6981,7 +6943,7 @@
     <w:basedOn w:val="DefaultParagraphFont"/>
     <w:uiPriority w:val="1"/>
     <w:qFormat/>
-    <w:rsid w:val="0011037F"/>
+    <w:rsid w:val="00451F0F"/>
     <w:rPr>
       <w:rFonts w:ascii="Linux Libertine" w:hAnsi="Linux Libertine" w:cs="Linux Libertine"/>
       <w:color w:val="auto"/>
@@ -6994,7 +6956,7 @@
     <w:basedOn w:val="DefaultParagraphFont"/>
     <w:uiPriority w:val="22"/>
     <w:qFormat/>
-    <w:rsid w:val="0011037F"/>
+    <w:rsid w:val="00451F0F"/>
     <w:rPr>
       <w:b/>
       <w:bCs/>
@@ -7005,7 +6967,7 @@
     <w:basedOn w:val="DefaultParagraphFont"/>
     <w:uiPriority w:val="1"/>
     <w:qFormat/>
-    <w:rsid w:val="0011037F"/>
+    <w:rsid w:val="00451F0F"/>
     <w:rPr>
       <w:rFonts w:ascii="Linux Libertine" w:hAnsi="Linux Libertine" w:cs="Linux Libertine"/>
       <w:color w:val="auto"/>
@@ -7018,7 +6980,7 @@
     <w:basedOn w:val="DefaultParagraphFont"/>
     <w:uiPriority w:val="1"/>
     <w:qFormat/>
-    <w:rsid w:val="0011037F"/>
+    <w:rsid w:val="00451F0F"/>
     <w:rPr>
       <w:rFonts w:ascii="Linux Libertine" w:hAnsi="Linux Libertine" w:cs="Linux Libertine"/>
       <w:color w:val="auto"/>
@@ -7031,7 +6993,7 @@
     <w:link w:val="TableCaptionChar"/>
     <w:autoRedefine/>
     <w:qFormat/>
-    <w:rsid w:val="0011037F"/>
+    <w:rsid w:val="00451F0F"/>
     <w:pPr>
       <w:keepNext/>
       <w:spacing w:before="360" w:after="200" w:line="240" w:lineRule="auto"/>
@@ -7049,7 +7011,7 @@
     <w:name w:val="TableCaption Char"/>
     <w:basedOn w:val="DefaultParagraphFont"/>
     <w:link w:val="TableCaption"/>
-    <w:rsid w:val="0011037F"/>
+    <w:rsid w:val="00451F0F"/>
     <w:rPr>
       <w:rFonts w:ascii="Linux Libertine" w:eastAsiaTheme="minorHAnsi" w:hAnsi="Linux Libertine" w:cs="Linux Libertine"/>
       <w:b/>
@@ -7063,7 +7025,7 @@
     <w:basedOn w:val="TableFootnote"/>
     <w:autoRedefine/>
     <w:qFormat/>
-    <w:rsid w:val="0011037F"/>
+    <w:rsid w:val="00451F0F"/>
     <w:rPr>
       <w:sz w:val="22"/>
     </w:rPr>
@@ -7073,7 +7035,7 @@
     <w:basedOn w:val="DefaultParagraphFont"/>
     <w:uiPriority w:val="1"/>
     <w:qFormat/>
-    <w:rsid w:val="0011037F"/>
+    <w:rsid w:val="00451F0F"/>
     <w:rPr>
       <w:color w:val="0000FF"/>
     </w:rPr>
@@ -7082,7 +7044,7 @@
     <w:name w:val="TitleNote"/>
     <w:basedOn w:val="AuthNotes"/>
     <w:qFormat/>
-    <w:rsid w:val="0011037F"/>
+    <w:rsid w:val="00451F0F"/>
     <w:rPr>
       <w:sz w:val="20"/>
     </w:rPr>
@@ -7091,37 +7053,37 @@
     <w:name w:val="TOC1"/>
     <w:basedOn w:val="Normal"/>
     <w:qFormat/>
-    <w:rsid w:val="0011037F"/>
+    <w:rsid w:val="00451F0F"/>
   </w:style>
   <w:style w:type="paragraph" w:customStyle="1" w:styleId="TOC2">
     <w:name w:val="TOC2"/>
     <w:basedOn w:val="Normal"/>
     <w:qFormat/>
-    <w:rsid w:val="0011037F"/>
+    <w:rsid w:val="00451F0F"/>
   </w:style>
   <w:style w:type="paragraph" w:customStyle="1" w:styleId="TOC3">
     <w:name w:val="TOC3"/>
     <w:basedOn w:val="Normal"/>
     <w:qFormat/>
-    <w:rsid w:val="0011037F"/>
+    <w:rsid w:val="00451F0F"/>
   </w:style>
   <w:style w:type="paragraph" w:customStyle="1" w:styleId="TOC4">
     <w:name w:val="TOC4"/>
     <w:basedOn w:val="Normal"/>
     <w:qFormat/>
-    <w:rsid w:val="0011037F"/>
+    <w:rsid w:val="00451F0F"/>
   </w:style>
   <w:style w:type="paragraph" w:customStyle="1" w:styleId="TOCHeading">
     <w:name w:val="TOCHeading"/>
     <w:basedOn w:val="Normal"/>
     <w:qFormat/>
-    <w:rsid w:val="0011037F"/>
+    <w:rsid w:val="00451F0F"/>
   </w:style>
   <w:style w:type="paragraph" w:customStyle="1" w:styleId="Update">
     <w:name w:val="Update"/>
     <w:basedOn w:val="Normal"/>
     <w:qFormat/>
-    <w:rsid w:val="0011037F"/>
+    <w:rsid w:val="00451F0F"/>
     <w:pPr>
       <w:pBdr>
         <w:top w:val="dashed" w:sz="4" w:space="6" w:color="auto"/>
@@ -7143,7 +7105,7 @@
     <w:basedOn w:val="DefaultParagraphFont"/>
     <w:uiPriority w:val="1"/>
     <w:qFormat/>
-    <w:rsid w:val="0011037F"/>
+    <w:rsid w:val="00451F0F"/>
     <w:rPr>
       <w:rFonts w:ascii="Linux Libertine" w:hAnsi="Linux Libertine" w:cs="Linux Libertine"/>
       <w:color w:val="auto"/>
@@ -7156,13 +7118,13 @@
     <w:basedOn w:val="Normal"/>
     <w:next w:val="Normal"/>
     <w:qFormat/>
-    <w:rsid w:val="0011037F"/>
+    <w:rsid w:val="00451F0F"/>
   </w:style>
   <w:style w:type="paragraph" w:customStyle="1" w:styleId="VersoLRH">
     <w:name w:val="Verso_(LRH)"/>
     <w:autoRedefine/>
     <w:qFormat/>
-    <w:rsid w:val="0011037F"/>
+    <w:rsid w:val="00451F0F"/>
     <w:pPr>
       <w:spacing w:after="0" w:line="240" w:lineRule="auto"/>
     </w:pPr>
@@ -7177,7 +7139,7 @@
     <w:name w:val="Video"/>
     <w:basedOn w:val="Normal"/>
     <w:qFormat/>
-    <w:rsid w:val="0011037F"/>
+    <w:rsid w:val="00451F0F"/>
     <w:pPr>
       <w:pBdr>
         <w:top w:val="wave" w:sz="6" w:space="8" w:color="auto"/>
@@ -7198,7 +7160,7 @@
     <w:basedOn w:val="DefaultParagraphFont"/>
     <w:uiPriority w:val="1"/>
     <w:qFormat/>
-    <w:rsid w:val="0011037F"/>
+    <w:rsid w:val="00451F0F"/>
     <w:rPr>
       <w:rFonts w:ascii="Linux Libertine" w:hAnsi="Linux Libertine" w:cs="Linux Libertine"/>
       <w:color w:val="auto"/>
@@ -7211,7 +7173,7 @@
     <w:basedOn w:val="DefaultParagraphFont"/>
     <w:uiPriority w:val="1"/>
     <w:qFormat/>
-    <w:rsid w:val="0011037F"/>
+    <w:rsid w:val="00451F0F"/>
     <w:rPr>
       <w:rFonts w:ascii="Linux Libertine" w:hAnsi="Linux Libertine" w:cs="Linux Libertine"/>
       <w:color w:val="auto"/>
@@ -7224,7 +7186,7 @@
     <w:basedOn w:val="Normal"/>
     <w:next w:val="Normal"/>
     <w:qFormat/>
-    <w:rsid w:val="0011037F"/>
+    <w:rsid w:val="00451F0F"/>
   </w:style>
   <w:style w:type="character" w:styleId="PageNumber">
     <w:name w:val="page number"/>
@@ -7232,7 +7194,7 @@
     <w:uiPriority w:val="99"/>
     <w:semiHidden/>
     <w:unhideWhenUsed/>
-    <w:rsid w:val="0011037F"/>
+    <w:rsid w:val="00451F0F"/>
     <w:rPr>
       <w:rFonts w:ascii="Linux Libertine" w:hAnsi="Linux Libertine" w:cs="Linux Libertine"/>
       <w:sz w:val="14"/>
@@ -7244,7 +7206,7 @@
     <w:uiPriority w:val="99"/>
     <w:semiHidden/>
     <w:unhideWhenUsed/>
-    <w:rsid w:val="0011037F"/>
+    <w:rsid w:val="00451F0F"/>
     <w:rPr>
       <w:sz w:val="16"/>
     </w:rPr>
@@ -7253,7 +7215,7 @@
     <w:name w:val="No Spacing"/>
     <w:uiPriority w:val="1"/>
     <w:qFormat/>
-    <w:rsid w:val="0011037F"/>
+    <w:rsid w:val="00451F0F"/>
     <w:pPr>
       <w:spacing w:after="0" w:line="240" w:lineRule="auto"/>
     </w:pPr>
@@ -7269,7 +7231,7 @@
     <w:basedOn w:val="DefaultParagraphFont"/>
     <w:uiPriority w:val="1"/>
     <w:qFormat/>
-    <w:rsid w:val="0011037F"/>
+    <w:rsid w:val="00451F0F"/>
     <w:rPr>
       <w:rFonts w:ascii="Linux Libertine" w:hAnsi="Linux Libertine" w:cs="Linux Libertine"/>
       <w:color w:val="3A7C22" w:themeColor="accent6" w:themeShade="BF"/>
@@ -7280,7 +7242,7 @@
     <w:basedOn w:val="DefaultParagraphFont"/>
     <w:uiPriority w:val="1"/>
     <w:qFormat/>
-    <w:rsid w:val="0011037F"/>
+    <w:rsid w:val="00451F0F"/>
     <w:rPr>
       <w:rFonts w:ascii="Linux Libertine" w:hAnsi="Linux Libertine" w:cs="Linux Libertine"/>
       <w:bdr w:val="none" w:sz="0" w:space="0" w:color="auto"/>
@@ -7290,25 +7252,25 @@
   <w:style w:type="character" w:customStyle="1" w:styleId="term-InText">
     <w:name w:val="term-InText"/>
     <w:uiPriority w:val="1"/>
-    <w:rsid w:val="0011037F"/>
+    <w:rsid w:val="00451F0F"/>
   </w:style>
   <w:style w:type="paragraph" w:customStyle="1" w:styleId="CCSHead">
     <w:name w:val="CCSHead"/>
     <w:basedOn w:val="KeyWordHead"/>
     <w:qFormat/>
-    <w:rsid w:val="0011037F"/>
+    <w:rsid w:val="00451F0F"/>
   </w:style>
   <w:style w:type="paragraph" w:customStyle="1" w:styleId="CCSDescription">
     <w:name w:val="CCSDescription"/>
     <w:basedOn w:val="KeyWords"/>
     <w:qFormat/>
-    <w:rsid w:val="0011037F"/>
+    <w:rsid w:val="00451F0F"/>
   </w:style>
   <w:style w:type="paragraph" w:customStyle="1" w:styleId="RefFormatHead">
     <w:name w:val="RefFormatHead"/>
     <w:basedOn w:val="Normal"/>
     <w:qFormat/>
-    <w:rsid w:val="0011037F"/>
+    <w:rsid w:val="00451F0F"/>
     <w:pPr>
       <w:keepNext/>
       <w:spacing w:before="60" w:after="60"/>
@@ -7321,7 +7283,7 @@
     <w:name w:val="RefFormatPara"/>
     <w:basedOn w:val="Normal"/>
     <w:qFormat/>
-    <w:rsid w:val="0011037F"/>
+    <w:rsid w:val="00451F0F"/>
     <w:pPr>
       <w:spacing w:before="60" w:after="60"/>
       <w:contextualSpacing/>
@@ -7331,7 +7293,7 @@
     <w:name w:val="Algorithm"/>
     <w:basedOn w:val="Normal"/>
     <w:qFormat/>
-    <w:rsid w:val="0011037F"/>
+    <w:rsid w:val="00451F0F"/>
     <w:pPr>
       <w:spacing w:line="240" w:lineRule="auto"/>
     </w:pPr>
@@ -7340,7 +7302,7 @@
     <w:name w:val="Style1"/>
     <w:basedOn w:val="Head4"/>
     <w:qFormat/>
-    <w:rsid w:val="0011037F"/>
+    <w:rsid w:val="00451F0F"/>
     <w:pPr>
       <w:numPr>
         <w:ilvl w:val="0"/>
@@ -7352,14 +7314,14 @@
     <w:name w:val="PermissionBlock"/>
     <w:basedOn w:val="FootnoteText"/>
     <w:qFormat/>
-    <w:rsid w:val="0011037F"/>
+    <w:rsid w:val="00451F0F"/>
   </w:style>
   <w:style w:type="character" w:customStyle="1" w:styleId="ArticleNumber">
     <w:name w:val="ArticleNumber"/>
     <w:basedOn w:val="DefaultParagraphFont"/>
     <w:uiPriority w:val="1"/>
     <w:qFormat/>
-    <w:rsid w:val="0011037F"/>
+    <w:rsid w:val="00451F0F"/>
     <w:rPr>
       <w:rFonts w:ascii="Linux Libertine" w:hAnsi="Linux Libertine" w:cs="Linux Libertine"/>
       <w:color w:val="7030A0"/>
@@ -7369,7 +7331,7 @@
     <w:name w:val="Image"/>
     <w:basedOn w:val="Normal"/>
     <w:qFormat/>
-    <w:rsid w:val="0011037F"/>
+    <w:rsid w:val="00451F0F"/>
     <w:pPr>
       <w:keepNext/>
     </w:pPr>
@@ -7382,7 +7344,7 @@
     <w:uiPriority w:val="99"/>
     <w:semiHidden/>
     <w:unhideWhenUsed/>
-    <w:rsid w:val="0011037F"/>
+    <w:rsid w:val="00451F0F"/>
   </w:style>
   <w:style w:type="character" w:customStyle="1" w:styleId="DateChar1">
     <w:name w:val="Date Char1"/>
@@ -7390,7 +7352,7 @@
     <w:link w:val="Date"/>
     <w:uiPriority w:val="99"/>
     <w:semiHidden/>
-    <w:rsid w:val="0011037F"/>
+    <w:rsid w:val="00451F0F"/>
     <w:rPr>
       <w:rFonts w:ascii="Linux Libertine" w:eastAsiaTheme="minorHAnsi" w:hAnsi="Linux Libertine" w:cs="Linux Libertine"/>
       <w:kern w:val="0"/>
@@ -7404,7 +7366,7 @@
     <w:uiPriority w:val="99"/>
     <w:semiHidden/>
     <w:unhideWhenUsed/>
-    <w:rsid w:val="0011037F"/>
+    <w:rsid w:val="00451F0F"/>
     <w:pPr>
       <w:ind w:left="360" w:hanging="360"/>
       <w:contextualSpacing/>
@@ -7416,7 +7378,7 @@
     <w:uiPriority w:val="99"/>
     <w:semiHidden/>
     <w:unhideWhenUsed/>
-    <w:rsid w:val="0011037F"/>
+    <w:rsid w:val="00451F0F"/>
     <w:pPr>
       <w:ind w:left="720" w:hanging="360"/>
       <w:contextualSpacing/>
@@ -7428,7 +7390,7 @@
     <w:uiPriority w:val="99"/>
     <w:semiHidden/>
     <w:unhideWhenUsed/>
-    <w:rsid w:val="0011037F"/>
+    <w:rsid w:val="00451F0F"/>
     <w:pPr>
       <w:ind w:left="1080" w:hanging="360"/>
       <w:contextualSpacing/>
@@ -7440,7 +7402,7 @@
     <w:uiPriority w:val="99"/>
     <w:semiHidden/>
     <w:unhideWhenUsed/>
-    <w:rsid w:val="0011037F"/>
+    <w:rsid w:val="00451F0F"/>
     <w:pPr>
       <w:ind w:left="1440" w:hanging="360"/>
       <w:contextualSpacing/>
@@ -7452,7 +7414,7 @@
     <w:uiPriority w:val="99"/>
     <w:semiHidden/>
     <w:unhideWhenUsed/>
-    <w:rsid w:val="0011037F"/>
+    <w:rsid w:val="00451F0F"/>
     <w:pPr>
       <w:ind w:left="1800" w:hanging="360"/>
       <w:contextualSpacing/>
@@ -7464,7 +7426,7 @@
     <w:uiPriority w:val="99"/>
     <w:semiHidden/>
     <w:unhideWhenUsed/>
-    <w:rsid w:val="0011037F"/>
+    <w:rsid w:val="00451F0F"/>
     <w:pPr>
       <w:numPr>
         <w:numId w:val="2"/>
@@ -7478,7 +7440,7 @@
     <w:uiPriority w:val="99"/>
     <w:semiHidden/>
     <w:unhideWhenUsed/>
-    <w:rsid w:val="0011037F"/>
+    <w:rsid w:val="00451F0F"/>
     <w:pPr>
       <w:numPr>
         <w:numId w:val="3"/>
@@ -7492,7 +7454,7 @@
     <w:uiPriority w:val="99"/>
     <w:semiHidden/>
     <w:unhideWhenUsed/>
-    <w:rsid w:val="0011037F"/>
+    <w:rsid w:val="00451F0F"/>
     <w:pPr>
       <w:numPr>
         <w:numId w:val="4"/>
@@ -7506,7 +7468,7 @@
     <w:uiPriority w:val="99"/>
     <w:semiHidden/>
     <w:unhideWhenUsed/>
-    <w:rsid w:val="0011037F"/>
+    <w:rsid w:val="00451F0F"/>
     <w:pPr>
       <w:numPr>
         <w:numId w:val="5"/>
@@ -7520,7 +7482,7 @@
     <w:uiPriority w:val="99"/>
     <w:semiHidden/>
     <w:unhideWhenUsed/>
-    <w:rsid w:val="0011037F"/>
+    <w:rsid w:val="00451F0F"/>
     <w:pPr>
       <w:numPr>
         <w:numId w:val="6"/>
@@ -7534,7 +7496,7 @@
     <w:uiPriority w:val="99"/>
     <w:semiHidden/>
     <w:unhideWhenUsed/>
-    <w:rsid w:val="0011037F"/>
+    <w:rsid w:val="00451F0F"/>
     <w:pPr>
       <w:spacing w:after="120"/>
       <w:ind w:left="360"/>
@@ -7547,7 +7509,7 @@
     <w:uiPriority w:val="99"/>
     <w:semiHidden/>
     <w:unhideWhenUsed/>
-    <w:rsid w:val="0011037F"/>
+    <w:rsid w:val="00451F0F"/>
     <w:pPr>
       <w:spacing w:after="120"/>
       <w:ind w:left="720"/>
@@ -7560,7 +7522,7 @@
     <w:uiPriority w:val="99"/>
     <w:semiHidden/>
     <w:unhideWhenUsed/>
-    <w:rsid w:val="0011037F"/>
+    <w:rsid w:val="00451F0F"/>
     <w:pPr>
       <w:spacing w:after="120"/>
       <w:ind w:left="1080"/>
@@ -7573,7 +7535,7 @@
     <w:uiPriority w:val="99"/>
     <w:semiHidden/>
     <w:unhideWhenUsed/>
-    <w:rsid w:val="0011037F"/>
+    <w:rsid w:val="00451F0F"/>
     <w:pPr>
       <w:spacing w:after="120"/>
       <w:ind w:left="1440"/>
@@ -7586,7 +7548,7 @@
     <w:uiPriority w:val="99"/>
     <w:semiHidden/>
     <w:unhideWhenUsed/>
-    <w:rsid w:val="0011037F"/>
+    <w:rsid w:val="00451F0F"/>
     <w:pPr>
       <w:spacing w:after="120"/>
       <w:ind w:left="1800"/>
@@ -7599,7 +7561,7 @@
     <w:uiPriority w:val="99"/>
     <w:semiHidden/>
     <w:unhideWhenUsed/>
-    <w:rsid w:val="0011037F"/>
+    <w:rsid w:val="00451F0F"/>
     <w:pPr>
       <w:numPr>
         <w:numId w:val="7"/>
@@ -7613,7 +7575,7 @@
     <w:uiPriority w:val="99"/>
     <w:semiHidden/>
     <w:unhideWhenUsed/>
-    <w:rsid w:val="0011037F"/>
+    <w:rsid w:val="00451F0F"/>
     <w:pPr>
       <w:numPr>
         <w:numId w:val="8"/>
@@ -7627,7 +7589,7 @@
     <w:uiPriority w:val="99"/>
     <w:semiHidden/>
     <w:unhideWhenUsed/>
-    <w:rsid w:val="0011037F"/>
+    <w:rsid w:val="00451F0F"/>
     <w:pPr>
       <w:numPr>
         <w:numId w:val="9"/>
@@ -7641,7 +7603,7 @@
     <w:uiPriority w:val="99"/>
     <w:semiHidden/>
     <w:unhideWhenUsed/>
-    <w:rsid w:val="0011037F"/>
+    <w:rsid w:val="00451F0F"/>
     <w:pPr>
       <w:numPr>
         <w:numId w:val="10"/>
@@ -7655,7 +7617,7 @@
     <w:uiPriority w:val="99"/>
     <w:semiHidden/>
     <w:unhideWhenUsed/>
-    <w:rsid w:val="0011037F"/>
+    <w:rsid w:val="00451F0F"/>
     <w:pPr>
       <w:numPr>
         <w:numId w:val="11"/>
@@ -7669,7 +7631,7 @@
     <w:uiPriority w:val="99"/>
     <w:semiHidden/>
     <w:unhideWhenUsed/>
-    <w:rsid w:val="0011037F"/>
+    <w:rsid w:val="00451F0F"/>
     <w:pPr>
       <w:ind w:left="720"/>
     </w:pPr>
@@ -7682,7 +7644,7 @@
     <w:uiPriority w:val="99"/>
     <w:semiHidden/>
     <w:unhideWhenUsed/>
-    <w:rsid w:val="0011037F"/>
+    <w:rsid w:val="00451F0F"/>
     <w:pPr>
       <w:spacing w:line="240" w:lineRule="auto"/>
     </w:pPr>
@@ -7693,7 +7655,7 @@
     <w:link w:val="NoteHeading"/>
     <w:uiPriority w:val="99"/>
     <w:semiHidden/>
-    <w:rsid w:val="0011037F"/>
+    <w:rsid w:val="00451F0F"/>
     <w:rPr>
       <w:rFonts w:ascii="Linux Libertine" w:eastAsiaTheme="minorHAnsi" w:hAnsi="Linux Libertine" w:cs="Linux Libertine"/>
       <w:kern w:val="0"/>
@@ -7708,7 +7670,7 @@
     <w:link w:val="QuoteChar"/>
     <w:uiPriority w:val="29"/>
     <w:qFormat/>
-    <w:rsid w:val="0011037F"/>
+    <w:rsid w:val="00451F0F"/>
     <w:pPr>
       <w:spacing w:before="200" w:after="160"/>
       <w:ind w:left="864" w:right="864"/>
@@ -7725,7 +7687,7 @@
     <w:basedOn w:val="DefaultParagraphFont"/>
     <w:link w:val="Quote"/>
     <w:uiPriority w:val="29"/>
-    <w:rsid w:val="0011037F"/>
+    <w:rsid w:val="00451F0F"/>
     <w:rPr>
       <w:rFonts w:ascii="Linux Libertine" w:eastAsiaTheme="minorHAnsi" w:hAnsi="Linux Libertine" w:cs="Linux Libertine"/>
       <w:i/>
@@ -7741,7 +7703,7 @@
     <w:basedOn w:val="DefaultParagraphFont"/>
     <w:uiPriority w:val="33"/>
     <w:qFormat/>
-    <w:rsid w:val="0011037F"/>
+    <w:rsid w:val="00451F0F"/>
     <w:rPr>
       <w:rFonts w:ascii="Linux Libertine" w:hAnsi="Linux Libertine" w:cs="Linux Libertine"/>
       <w:b/>
@@ -7759,7 +7721,7 @@
     <w:semiHidden/>
     <w:unhideWhenUsed/>
     <w:qFormat/>
-    <w:rsid w:val="0011037F"/>
+    <w:rsid w:val="00451F0F"/>
     <w:pPr>
       <w:spacing w:after="200" w:line="240" w:lineRule="auto"/>
     </w:pPr>
@@ -7774,7 +7736,7 @@
     <w:name w:val="ComputerCode"/>
     <w:basedOn w:val="Normal"/>
     <w:qFormat/>
-    <w:rsid w:val="0011037F"/>
+    <w:rsid w:val="00451F0F"/>
     <w:pPr>
       <w:spacing w:before="60" w:after="60" w:line="360" w:lineRule="auto"/>
     </w:pPr>
@@ -7787,7 +7749,7 @@
     <w:name w:val="ACMRefHead"/>
     <w:basedOn w:val="Normal"/>
     <w:qFormat/>
-    <w:rsid w:val="0011037F"/>
+    <w:rsid w:val="00451F0F"/>
     <w:pPr>
       <w:keepNext/>
       <w:spacing w:before="60" w:after="60"/>
@@ -7800,7 +7762,7 @@
     <w:name w:val="ACMRef"/>
     <w:basedOn w:val="Normal"/>
     <w:qFormat/>
-    <w:rsid w:val="0011037F"/>
+    <w:rsid w:val="00451F0F"/>
     <w:pPr>
       <w:keepNext/>
       <w:spacing w:before="60" w:after="60"/>
@@ -7810,7 +7772,7 @@
     <w:name w:val="PostHeadPara"/>
     <w:basedOn w:val="Para"/>
     <w:qFormat/>
-    <w:rsid w:val="0011037F"/>
+    <w:rsid w:val="00451F0F"/>
     <w:pPr>
       <w:ind w:firstLine="0"/>
     </w:pPr>
@@ -7819,14 +7781,14 @@
     <w:name w:val="ListParagraph"/>
     <w:basedOn w:val="ListParagraph"/>
     <w:qFormat/>
-    <w:rsid w:val="0011037F"/>
+    <w:rsid w:val="00451F0F"/>
   </w:style>
   <w:style w:type="paragraph" w:customStyle="1" w:styleId="Subtitle0">
     <w:name w:val="Sub_title"/>
     <w:basedOn w:val="Subtitle"/>
     <w:link w:val="SubtitleChar0"/>
     <w:qFormat/>
-    <w:rsid w:val="0011037F"/>
+    <w:rsid w:val="00451F0F"/>
     <w:pPr>
       <w:jc w:val="left"/>
     </w:pPr>
@@ -7835,7 +7797,7 @@
     <w:name w:val="Sub_title Char"/>
     <w:basedOn w:val="SubtitleChar"/>
     <w:link w:val="Subtitle0"/>
-    <w:rsid w:val="0011037F"/>
+    <w:rsid w:val="00451F0F"/>
     <w:rPr>
       <w:rFonts w:ascii="Linux Biolinum" w:eastAsiaTheme="majorEastAsia" w:hAnsi="Linux Biolinum" w:cs="Linux Biolinum"/>
       <w:iCs/>
@@ -7846,7 +7808,7 @@
     <w:name w:val="Short Title"/>
     <w:basedOn w:val="Titledocument"/>
     <w:qFormat/>
-    <w:rsid w:val="0011037F"/>
+    <w:rsid w:val="00451F0F"/>
     <w:rPr>
       <w:sz w:val="18"/>
     </w:rPr>
@@ -7855,14 +7817,14 @@
     <w:name w:val="Normal1"/>
     <w:basedOn w:val="Normal"/>
     <w:qFormat/>
-    <w:rsid w:val="0011037F"/>
+    <w:rsid w:val="00451F0F"/>
   </w:style>
   <w:style w:type="character" w:customStyle="1" w:styleId="In-textcode">
     <w:name w:val="In-text code"/>
     <w:basedOn w:val="DefaultParagraphFont"/>
     <w:uiPriority w:val="1"/>
     <w:qFormat/>
-    <w:rsid w:val="0011037F"/>
+    <w:rsid w:val="00451F0F"/>
     <w:rPr>
       <w:rFonts w:ascii="Courier New" w:hAnsi="Courier New"/>
     </w:rPr>
@@ -7871,7 +7833,7 @@
     <w:name w:val="FrAbstract"/>
     <w:basedOn w:val="Abstract"/>
     <w:qFormat/>
-    <w:rsid w:val="0011037F"/>
+    <w:rsid w:val="00451F0F"/>
   </w:style>
   <w:style w:type="paragraph" w:customStyle="1" w:styleId="FrAbsHead">
     <w:name w:val="FrAbsHead"/>
@@ -7879,19 +7841,19 @@
     <w:next w:val="FrAbstract"/>
     <w:link w:val="FrAbsHeadChar"/>
     <w:qFormat/>
-    <w:rsid w:val="0011037F"/>
+    <w:rsid w:val="00451F0F"/>
   </w:style>
   <w:style w:type="paragraph" w:customStyle="1" w:styleId="FrKeyWords">
     <w:name w:val="FrKeyWords"/>
     <w:basedOn w:val="KeyWords"/>
     <w:qFormat/>
-    <w:rsid w:val="0011037F"/>
+    <w:rsid w:val="00451F0F"/>
   </w:style>
   <w:style w:type="character" w:customStyle="1" w:styleId="FrAbsHeadChar">
     <w:name w:val="FrAbsHead Char"/>
     <w:basedOn w:val="AbsHeadChar"/>
     <w:link w:val="FrAbsHead"/>
-    <w:rsid w:val="0011037F"/>
+    <w:rsid w:val="00451F0F"/>
     <w:rPr>
       <w:rFonts w:ascii="Linux Biolinum" w:eastAsiaTheme="minorHAnsi" w:hAnsi="Linux Biolinum" w:cs="Linux Biolinum"/>
       <w:b/>
@@ -7906,13 +7868,13 @@
     <w:basedOn w:val="KeyWordHead"/>
     <w:next w:val="FrKeyWords"/>
     <w:qFormat/>
-    <w:rsid w:val="0011037F"/>
+    <w:rsid w:val="00451F0F"/>
   </w:style>
   <w:style w:type="paragraph" w:customStyle="1" w:styleId="GrAbstract">
     <w:name w:val="GrAbstract"/>
     <w:basedOn w:val="Abstract"/>
     <w:qFormat/>
-    <w:rsid w:val="0011037F"/>
+    <w:rsid w:val="00451F0F"/>
   </w:style>
   <w:style w:type="paragraph" w:customStyle="1" w:styleId="GrAbsHead">
     <w:name w:val="GrAbsHead"/>
@@ -7920,19 +7882,19 @@
     <w:next w:val="GrAbstract"/>
     <w:link w:val="GrAbsHeadChar"/>
     <w:qFormat/>
-    <w:rsid w:val="0011037F"/>
+    <w:rsid w:val="00451F0F"/>
   </w:style>
   <w:style w:type="paragraph" w:customStyle="1" w:styleId="GrKeyWords">
     <w:name w:val="GrKeyWords"/>
     <w:basedOn w:val="KeyWords"/>
     <w:qFormat/>
-    <w:rsid w:val="0011037F"/>
+    <w:rsid w:val="00451F0F"/>
   </w:style>
   <w:style w:type="character" w:customStyle="1" w:styleId="GrAbsHeadChar">
     <w:name w:val="GrAbsHead Char"/>
     <w:basedOn w:val="AbsHeadChar"/>
     <w:link w:val="GrAbsHead"/>
-    <w:rsid w:val="0011037F"/>
+    <w:rsid w:val="00451F0F"/>
     <w:rPr>
       <w:rFonts w:ascii="Linux Biolinum" w:eastAsiaTheme="minorHAnsi" w:hAnsi="Linux Biolinum" w:cs="Linux Biolinum"/>
       <w:b/>
@@ -7946,31 +7908,31 @@
     <w:name w:val="GrKeyWordHead"/>
     <w:basedOn w:val="KeyWordHead"/>
     <w:qFormat/>
-    <w:rsid w:val="0011037F"/>
+    <w:rsid w:val="00451F0F"/>
   </w:style>
   <w:style w:type="paragraph" w:customStyle="1" w:styleId="SpAbstract">
     <w:name w:val="SpAbstract"/>
     <w:basedOn w:val="Abstract"/>
     <w:qFormat/>
-    <w:rsid w:val="0011037F"/>
+    <w:rsid w:val="00451F0F"/>
   </w:style>
   <w:style w:type="paragraph" w:customStyle="1" w:styleId="SpAbsHead">
     <w:name w:val="SpAbsHead"/>
     <w:basedOn w:val="AbsHead"/>
     <w:qFormat/>
-    <w:rsid w:val="0011037F"/>
+    <w:rsid w:val="00451F0F"/>
   </w:style>
   <w:style w:type="paragraph" w:customStyle="1" w:styleId="SpKeyWords">
     <w:name w:val="SpKeyWords"/>
     <w:basedOn w:val="KeyWords"/>
     <w:qFormat/>
-    <w:rsid w:val="0011037F"/>
+    <w:rsid w:val="00451F0F"/>
   </w:style>
   <w:style w:type="paragraph" w:customStyle="1" w:styleId="SpKeyWordHead">
     <w:name w:val="SpKeyWordHead"/>
     <w:basedOn w:val="KeyWordHead"/>
     <w:qFormat/>
-    <w:rsid w:val="0011037F"/>
+    <w:rsid w:val="00451F0F"/>
   </w:style>
 </w:styles>
 </file>

</xml_diff>